<commit_message>
TFM PAS 3-4: objectius, hipòtesis, materials i mètodes i esquelet de resultats
Afegeix el capítol 3 (objectiu general, 4 objectius específics i 4 hipòtesis),
el capítol 4 (àrea d'estudi, disseny experimental, vols de dron i sensors,
processament fotogramètric, mesures de camp, models TSEB i S-W amb CWSI i
anàlisi estadística) i l'esquelet dels capítols 5-7 amb buits marcats per
omplir amb dades reals.

Co-Authored-By: Claude Opus 4.8 <noreply@anthropic.com>
Claude-Session: https://claude.ai/code/session_015S8J5VNEjqUNJtc1c5qPf1
</commit_message>
<xml_diff>
--- a/TFM_Pau_Planes.docx
+++ b/TFM_Pau_Planes.docx
@@ -1633,6 +1633,861 @@
           <w:sz w:val="24"/>
         </w:rPr>
         <w:t>La mesura de referència de l'estat hídric de la planta és el potencial hídric de tija al migdia (Ψstem), determinat amb cambra de pressió en fulles prèviament embolcallades. Choné et al. (2001) van demostrar que el Ψstem és l'indicador més sensible i discriminant de l'estat hídric de la vinya, motiu pel qual s'utilitza en aquest treball com a referència per validar el CWSI derivat de la teledetecció.</w:t>
+      </w:r>
+    </w:p>
+    <w:p>
+      <w:pPr>
+        <w:pStyle w:val="Heading1"/>
+        <w:spacing w:before="320" w:after="160"/>
+      </w:pPr>
+      <w:r>
+        <w:rPr>
+          <w:rFonts w:ascii="Arial" w:hAnsi="Arial" w:cs="Arial"/>
+          <w:b/>
+          <w:i w:val="0"/>
+          <w:sz w:val="28"/>
+        </w:rPr>
+        <w:t>3. Objectius i hipòtesis</w:t>
+      </w:r>
+    </w:p>
+    <w:p>
+      <w:pPr>
+        <w:pStyle w:val="Heading2"/>
+        <w:spacing w:before="240" w:after="160"/>
+      </w:pPr>
+      <w:r>
+        <w:rPr>
+          <w:rFonts w:ascii="Arial" w:hAnsi="Arial" w:cs="Arial"/>
+          <w:b/>
+          <w:i w:val="0"/>
+          <w:sz w:val="26"/>
+        </w:rPr>
+        <w:t>3.1. Objectiu general</w:t>
+      </w:r>
+    </w:p>
+    <w:p>
+      <w:pPr>
+        <w:spacing w:after="120" w:before="0"/>
+      </w:pPr>
+      <w:r>
+        <w:rPr>
+          <w:rFonts w:ascii="Arial" w:hAnsi="Arial" w:cs="Arial"/>
+          <w:b w:val="0"/>
+          <w:i w:val="0"/>
+          <w:sz w:val="24"/>
+        </w:rPr>
+        <w:t>L'objectiu general d'aquest treball és avaluar l'efecte de diferents tractaments de poda sobre l'evapotranspiració de la vinya mitjançant teledetecció d'alta precisió amb dron i mesures de radiació PAR en camp.</w:t>
+      </w:r>
+    </w:p>
+    <w:p>
+      <w:pPr>
+        <w:pStyle w:val="Heading2"/>
+        <w:spacing w:before="240" w:after="160"/>
+      </w:pPr>
+      <w:r>
+        <w:rPr>
+          <w:rFonts w:ascii="Arial" w:hAnsi="Arial" w:cs="Arial"/>
+          <w:b/>
+          <w:i w:val="0"/>
+          <w:sz w:val="26"/>
+        </w:rPr>
+        <w:t>3.2. Objectius específics</w:t>
+      </w:r>
+    </w:p>
+    <w:p>
+      <w:pPr>
+        <w:pStyle w:val="ListNumber"/>
+        <w:spacing w:after="120"/>
+        <w:jc w:val="both"/>
+      </w:pPr>
+      <w:r>
+        <w:rPr>
+          <w:rFonts w:ascii="Arial" w:hAnsi="Arial" w:cs="Arial"/>
+          <w:b w:val="0"/>
+          <w:i w:val="0"/>
+          <w:sz w:val="24"/>
+        </w:rPr>
+        <w:t>Estimar les variables biofísiques del dosser (LAI, fIPAR diari, alçada i volum del dosser) per a cada tractament de poda a partir d'imatges multiespectrals i del núvol de punts fotogramètric obtinguts en tres vols de dron al llarg del cicle vegetatiu.</w:t>
+      </w:r>
+    </w:p>
+    <w:p>
+      <w:pPr>
+        <w:pStyle w:val="ListNumber"/>
+        <w:spacing w:after="120"/>
+        <w:jc w:val="both"/>
+      </w:pPr>
+      <w:r>
+        <w:rPr>
+          <w:rFonts w:ascii="Arial" w:hAnsi="Arial" w:cs="Arial"/>
+          <w:b w:val="0"/>
+          <w:i w:val="0"/>
+          <w:sz w:val="24"/>
+        </w:rPr>
+        <w:t>Calcular l'ETa i l'ETp de cada tractament de poda aplicant els models TSEB i Shuttleworth–Wallace a partir de les temperatures de dosser (Tc) i de sòl (Ts) obtingudes per imatge tèrmica d'alta resolució.</w:t>
+      </w:r>
+    </w:p>
+    <w:p>
+      <w:pPr>
+        <w:pStyle w:val="ListNumber"/>
+        <w:spacing w:after="120"/>
+        <w:jc w:val="both"/>
+      </w:pPr>
+      <w:r>
+        <w:rPr>
+          <w:rFonts w:ascii="Arial" w:hAnsi="Arial" w:cs="Arial"/>
+          <w:b w:val="0"/>
+          <w:i w:val="0"/>
+          <w:sz w:val="24"/>
+        </w:rPr>
+        <w:t>Validar les estimacions de fIPAR derivades de les imatges de dron amb mesures simultànies de ceptòmetre i d'imatges hemisfèriques, seguint el protocol de Belaid et al. (2025).</w:t>
+      </w:r>
+    </w:p>
+    <w:p>
+      <w:pPr>
+        <w:pStyle w:val="ListNumber"/>
+        <w:spacing w:after="120"/>
+        <w:jc w:val="both"/>
+      </w:pPr>
+      <w:r>
+        <w:rPr>
+          <w:rFonts w:ascii="Arial" w:hAnsi="Arial" w:cs="Arial"/>
+          <w:b w:val="0"/>
+          <w:i w:val="0"/>
+          <w:sz w:val="24"/>
+        </w:rPr>
+        <w:t>Quantificar l'índex d'estrès hídric del cultiu (CWSI = 1 − ETa/ETp) per a cada tractament de poda i relacionar-lo amb mesures de potencial hídric de tija (Ψstem).</w:t>
+      </w:r>
+    </w:p>
+    <w:p>
+      <w:pPr>
+        <w:pStyle w:val="Heading2"/>
+        <w:spacing w:before="240" w:after="160"/>
+      </w:pPr>
+      <w:r>
+        <w:rPr>
+          <w:rFonts w:ascii="Arial" w:hAnsi="Arial" w:cs="Arial"/>
+          <w:b/>
+          <w:i w:val="0"/>
+          <w:sz w:val="26"/>
+        </w:rPr>
+        <w:t>3.3. Hipòtesis</w:t>
+      </w:r>
+    </w:p>
+    <w:p>
+      <w:pPr>
+        <w:spacing w:after="120" w:before="0"/>
+      </w:pPr>
+      <w:r>
+        <w:rPr>
+          <w:rFonts w:ascii="Arial" w:hAnsi="Arial" w:cs="Arial"/>
+          <w:b w:val="0"/>
+          <w:i w:val="0"/>
+          <w:sz w:val="24"/>
+        </w:rPr>
+        <w:t>A partir dels objectius anteriors i del marc teòric, es plantegen les hipòtesis de treball següents:</w:t>
+      </w:r>
+    </w:p>
+    <w:p>
+      <w:pPr>
+        <w:spacing w:after="120"/>
+        <w:jc w:val="both"/>
+      </w:pPr>
+      <w:r>
+        <w:rPr>
+          <w:rFonts w:ascii="Arial" w:hAnsi="Arial" w:cs="Arial"/>
+          <w:b/>
+          <w:i w:val="0"/>
+          <w:sz w:val="24"/>
+        </w:rPr>
+        <w:t>H1.</w:t>
+      </w:r>
+      <w:r>
+        <w:rPr>
+          <w:rFonts w:ascii="Arial" w:hAnsi="Arial" w:cs="Arial"/>
+          <w:b w:val="0"/>
+          <w:i w:val="0"/>
+          <w:sz w:val="24"/>
+        </w:rPr>
+        <w:t xml:space="preserve"> Els tractaments de poda generen diferències significatives en les variables biofísiques del dosser (LAI, fIPAR, alçada i volum), detectables amb teledetecció d'alta resolució amb dron.</w:t>
+      </w:r>
+    </w:p>
+    <w:p>
+      <w:pPr>
+        <w:spacing w:after="120"/>
+        <w:jc w:val="both"/>
+      </w:pPr>
+      <w:r>
+        <w:rPr>
+          <w:rFonts w:ascii="Arial" w:hAnsi="Arial" w:cs="Arial"/>
+          <w:b/>
+          <w:i w:val="0"/>
+          <w:sz w:val="24"/>
+        </w:rPr>
+        <w:t>H2.</w:t>
+      </w:r>
+      <w:r>
+        <w:rPr>
+          <w:rFonts w:ascii="Arial" w:hAnsi="Arial" w:cs="Arial"/>
+          <w:b w:val="0"/>
+          <w:i w:val="0"/>
+          <w:sz w:val="24"/>
+        </w:rPr>
+        <w:t xml:space="preserve"> Els tractaments amb major vigor i volum de dosser presenten valors més elevats d'ETa, en ser més gran la superfície foliar transpirant i la radiació interceptada.</w:t>
+      </w:r>
+    </w:p>
+    <w:p>
+      <w:pPr>
+        <w:spacing w:after="120"/>
+        <w:jc w:val="both"/>
+      </w:pPr>
+      <w:r>
+        <w:rPr>
+          <w:rFonts w:ascii="Arial" w:hAnsi="Arial" w:cs="Arial"/>
+          <w:b/>
+          <w:i w:val="0"/>
+          <w:sz w:val="24"/>
+        </w:rPr>
+        <w:t>H3.</w:t>
+      </w:r>
+      <w:r>
+        <w:rPr>
+          <w:rFonts w:ascii="Arial" w:hAnsi="Arial" w:cs="Arial"/>
+          <w:b w:val="0"/>
+          <w:i w:val="0"/>
+          <w:sz w:val="24"/>
+        </w:rPr>
+        <w:t xml:space="preserve"> Les podes més restrictives augmenten el CWSI (major estrès hídric relatiu) i es tradueixen en valors de Ψstem més negatius.</w:t>
+      </w:r>
+    </w:p>
+    <w:p>
+      <w:pPr>
+        <w:spacing w:after="120"/>
+        <w:jc w:val="both"/>
+      </w:pPr>
+      <w:r>
+        <w:rPr>
+          <w:rFonts w:ascii="Arial" w:hAnsi="Arial" w:cs="Arial"/>
+          <w:b/>
+          <w:i w:val="0"/>
+          <w:sz w:val="24"/>
+        </w:rPr>
+        <w:t>H4.</w:t>
+      </w:r>
+      <w:r>
+        <w:rPr>
+          <w:rFonts w:ascii="Arial" w:hAnsi="Arial" w:cs="Arial"/>
+          <w:b w:val="0"/>
+          <w:i w:val="0"/>
+          <w:sz w:val="24"/>
+        </w:rPr>
+        <w:t xml:space="preserve"> La fIPAR estimada amb imatges hemisfèriques de baix cost (GoPro) presenta un grau d'acord elevat amb la mesura de ceptòmetre i amb la derivada de les imatges de dron, fet que en confirma l'aplicabilitat operacional en vinya.</w:t>
+      </w:r>
+    </w:p>
+    <w:p>
+      <w:pPr>
+        <w:pStyle w:val="Heading1"/>
+        <w:spacing w:before="320" w:after="160"/>
+      </w:pPr>
+      <w:r>
+        <w:rPr>
+          <w:rFonts w:ascii="Arial" w:hAnsi="Arial" w:cs="Arial"/>
+          <w:b/>
+          <w:i w:val="0"/>
+          <w:sz w:val="28"/>
+        </w:rPr>
+        <w:t>4. Materials i mètodes</w:t>
+      </w:r>
+    </w:p>
+    <w:p>
+      <w:pPr>
+        <w:pStyle w:val="Heading2"/>
+        <w:spacing w:before="240" w:after="160"/>
+      </w:pPr>
+      <w:r>
+        <w:rPr>
+          <w:rFonts w:ascii="Arial" w:hAnsi="Arial" w:cs="Arial"/>
+          <w:b/>
+          <w:i w:val="0"/>
+          <w:sz w:val="26"/>
+        </w:rPr>
+        <w:t>4.1. Àrea d'estudi i material vegetal</w:t>
+      </w:r>
+    </w:p>
+    <w:p>
+      <w:pPr>
+        <w:spacing w:after="120" w:before="0"/>
+      </w:pPr>
+      <w:r>
+        <w:rPr>
+          <w:rFonts w:ascii="Arial" w:hAnsi="Arial" w:cs="Arial"/>
+          <w:b w:val="0"/>
+          <w:i w:val="0"/>
+          <w:sz w:val="24"/>
+        </w:rPr>
+        <w:t>L'estudi es durà a terme en una parcel·la experimental de vinya gestionada per l'IRTA. La parcel·la es conrea seguint les pràctiques habituals de la zona, amb un sistema de reg localitzat per degoteig que permet aplicar tractaments de reg controlats.</w:t>
+      </w:r>
+    </w:p>
+    <w:p>
+      <w:pPr>
+        <w:spacing w:after="120" w:before="0"/>
+        <w:jc w:val="left"/>
+      </w:pPr>
+      <w:r>
+        <w:rPr>
+          <w:rFonts w:ascii="Arial" w:hAnsi="Arial" w:cs="Arial"/>
+          <w:b w:val="0"/>
+          <w:i/>
+          <w:color w:val="B00000"/>
+          <w:sz w:val="22"/>
+        </w:rPr>
+        <w:t>[A CONCRETAR AMB DADES DE LA FINCA] Localitat i coordenades de la parcel·la; varietat i portaempelt; any de plantació; marc de plantació (distància entre fileres i entre ceps); orientació de les fileres; sistema de conducció (espatllera vertical, etc.); tipus de sòl i característiques edafoclimàtiques; règim de reg aplicat.</w:t>
+      </w:r>
+    </w:p>
+    <w:p>
+      <w:pPr>
+        <w:pStyle w:val="Heading2"/>
+        <w:spacing w:before="240" w:after="160"/>
+      </w:pPr>
+      <w:r>
+        <w:rPr>
+          <w:rFonts w:ascii="Arial" w:hAnsi="Arial" w:cs="Arial"/>
+          <w:b/>
+          <w:i w:val="0"/>
+          <w:sz w:val="26"/>
+        </w:rPr>
+        <w:t>4.2. Disseny experimental</w:t>
+      </w:r>
+    </w:p>
+    <w:p>
+      <w:pPr>
+        <w:spacing w:after="120" w:before="0"/>
+      </w:pPr>
+      <w:r>
+        <w:rPr>
+          <w:rFonts w:ascii="Arial" w:hAnsi="Arial" w:cs="Arial"/>
+          <w:b w:val="0"/>
+          <w:i w:val="0"/>
+          <w:sz w:val="24"/>
+        </w:rPr>
+        <w:t>L'assaig s'estableix segons un disseny en blocs complets a l'atzar amb tres tractaments de poda i tres repeticions (blocs) per tractament, de manera que cada combinació tractament × bloc constitueix una parcel·la elemental amb un nombre definit de ceps de mostreig. Aquesta estructura permet controlar la variabilitat espacial del sòl dins la parcel·la i analitzar estadísticament l'efecte del tractament.</w:t>
+      </w:r>
+    </w:p>
+    <w:p>
+      <w:pPr>
+        <w:spacing w:after="120" w:before="0"/>
+        <w:jc w:val="left"/>
+      </w:pPr>
+      <w:r>
+        <w:rPr>
+          <w:rFonts w:ascii="Arial" w:hAnsi="Arial" w:cs="Arial"/>
+          <w:b w:val="0"/>
+          <w:i/>
+          <w:color w:val="B00000"/>
+          <w:sz w:val="22"/>
+        </w:rPr>
+        <w:t>[A CONCRETAR] Definició exacta dels tres tractaments de poda (p. ex., poda llarga tipus Guyot, poda curta en cordó Royat i poda mínima), nombre de gemmes deixades en cada cas, nombre de ceps per parcel·la elemental i esquema/croquis de la distribució dels blocs a la parcel·la (Figura).</w:t>
+      </w:r>
+    </w:p>
+    <w:p>
+      <w:pPr>
+        <w:pStyle w:val="Heading2"/>
+        <w:spacing w:before="240" w:after="160"/>
+      </w:pPr>
+      <w:r>
+        <w:rPr>
+          <w:rFonts w:ascii="Arial" w:hAnsi="Arial" w:cs="Arial"/>
+          <w:b/>
+          <w:i w:val="0"/>
+          <w:sz w:val="26"/>
+        </w:rPr>
+        <w:t>4.3. Vols de dron i sensors</w:t>
+      </w:r>
+    </w:p>
+    <w:p>
+      <w:pPr>
+        <w:spacing w:after="120" w:before="0"/>
+      </w:pPr>
+      <w:r>
+        <w:rPr>
+          <w:rFonts w:ascii="Arial" w:hAnsi="Arial" w:cs="Arial"/>
+          <w:b w:val="0"/>
+          <w:i w:val="0"/>
+          <w:sz w:val="24"/>
+        </w:rPr>
+        <w:t>Es realitzaran tres vols de dron al voltant del migdia solar en tres moments del cicle vegetatiu —brotació, tancament del raïm (proximitat a floració/quallat) i verol— per capturar la dinàmica estacional del dosser i de l'estat hídric. El dron anirà equipat amb dues càmeres: (i) una càmera multiespectral de sis bandes, incloent-hi la regió del red-edge, per al càlcul d'índexs de vegetació i l'estimació de LAI i fIPAR; i (ii) una càmera tèrmica per a l'obtenció de la temperatura de la superfície. Els vols es planificaran amb un solapament frontal i lateral elevat per garantir una bona reconstrucció fotogramètrica, i s'inclouran panells de calibratge radiomètric i punts de control terrestre georeferenciats.</w:t>
+      </w:r>
+    </w:p>
+    <w:p>
+      <w:pPr>
+        <w:spacing w:after="120" w:before="0"/>
+        <w:jc w:val="left"/>
+      </w:pPr>
+      <w:r>
+        <w:rPr>
+          <w:rFonts w:ascii="Arial" w:hAnsi="Arial" w:cs="Arial"/>
+          <w:b w:val="0"/>
+          <w:i/>
+          <w:color w:val="B00000"/>
+          <w:sz w:val="22"/>
+        </w:rPr>
+        <w:t>[A CONCRETAR] Model de dron i de cada càmera (fabricant, bandes espectrals, resolució tèrmica, GSD a l'altura de vol); altura de vol i solapaments; dates exactes dels tres vols; nombre i distribució dels punts de control (GCP); programari de planificació de vol.</w:t>
+      </w:r>
+    </w:p>
+    <w:p>
+      <w:pPr>
+        <w:pStyle w:val="Heading2"/>
+        <w:spacing w:before="240" w:after="160"/>
+      </w:pPr>
+      <w:r>
+        <w:rPr>
+          <w:rFonts w:ascii="Arial" w:hAnsi="Arial" w:cs="Arial"/>
+          <w:b/>
+          <w:i w:val="0"/>
+          <w:sz w:val="26"/>
+        </w:rPr>
+        <w:t>4.4. Processament fotogramètric i d'imatges</w:t>
+      </w:r>
+    </w:p>
+    <w:p>
+      <w:pPr>
+        <w:spacing w:after="120" w:before="0"/>
+      </w:pPr>
+      <w:r>
+        <w:rPr>
+          <w:rFonts w:ascii="Arial" w:hAnsi="Arial" w:cs="Arial"/>
+          <w:b w:val="0"/>
+          <w:i w:val="0"/>
+          <w:sz w:val="24"/>
+        </w:rPr>
+        <w:t>Les imatges adquirides es processaran fotogramètricament mitjançant tècniques de structure-from-motion per generar ortomosaics multiespectrals i tèrmics georeferenciats, així com el model digital de superfície (DSM) i el model digital del terreny (DTM). La diferència entre el DSM i el DTM permetrà derivar l'alçada del dosser i, per integració, el volum de capçada de cada cep. A partir dels ortomosaics multiespectrals es calcularan índexs de vegetació (p. ex., NDVI) i s'estimaran el LAI i la fIPAR mitjançant relacions empíriques calibrades amb les mesures de camp.</w:t>
+      </w:r>
+    </w:p>
+    <w:p>
+      <w:pPr>
+        <w:spacing w:after="120" w:before="0"/>
+      </w:pPr>
+      <w:r>
+        <w:rPr>
+          <w:rFonts w:ascii="Arial" w:hAnsi="Arial" w:cs="Arial"/>
+          <w:b w:val="0"/>
+          <w:i w:val="0"/>
+          <w:sz w:val="24"/>
+        </w:rPr>
+        <w:t>Per separar les fonts del balanç energètic, es realitzarà una segmentació supervisada de la coberta que distingirà els píxels purs de vegetació dels de sòl, obtenint així la temperatura de dosser (Tc) i la temperatura de sòl (Ts) necessàries per als models TSEB i Shuttleworth–Wallace. Tota la cadena de processament seguirà l'esquema descrit per Bellvert et al. (2021) per a cultius llenyosos amb imatges de dron.</w:t>
+      </w:r>
+    </w:p>
+    <w:p>
+      <w:pPr>
+        <w:spacing w:after="120" w:before="0"/>
+        <w:jc w:val="left"/>
+      </w:pPr>
+      <w:r>
+        <w:rPr>
+          <w:rFonts w:ascii="Arial" w:hAnsi="Arial" w:cs="Arial"/>
+          <w:b w:val="0"/>
+          <w:i/>
+          <w:color w:val="B00000"/>
+          <w:sz w:val="22"/>
+        </w:rPr>
+        <w:t>[A CONCRETAR] Programari fotogramètric utilitzat (p. ex., Agisoft Metashape o Pix4D); resolució dels ortomosaics; mètode i índexs concrets per estimar LAI i fIPAR i la seva calibració; criteri de segmentació vegetació/sòl.</w:t>
+      </w:r>
+    </w:p>
+    <w:p>
+      <w:pPr>
+        <w:pStyle w:val="Heading2"/>
+        <w:spacing w:before="240" w:after="160"/>
+      </w:pPr>
+      <w:r>
+        <w:rPr>
+          <w:rFonts w:ascii="Arial" w:hAnsi="Arial" w:cs="Arial"/>
+          <w:b/>
+          <w:i w:val="0"/>
+          <w:sz w:val="26"/>
+        </w:rPr>
+        <w:t>4.5. Mesures de camp i validació</w:t>
+      </w:r>
+    </w:p>
+    <w:p>
+      <w:pPr>
+        <w:spacing w:after="120" w:before="0"/>
+      </w:pPr>
+      <w:r>
+        <w:rPr>
+          <w:rFonts w:ascii="Arial" w:hAnsi="Arial" w:cs="Arial"/>
+          <w:b w:val="0"/>
+          <w:i w:val="0"/>
+          <w:sz w:val="24"/>
+        </w:rPr>
+        <w:t>Simultàniament a cada vol es prendran mesures de camp per parametritzar i validar els models:</w:t>
+      </w:r>
+    </w:p>
+    <w:p>
+      <w:pPr>
+        <w:pStyle w:val="ListBullet"/>
+        <w:spacing w:after="120"/>
+        <w:jc w:val="both"/>
+      </w:pPr>
+      <w:r>
+        <w:rPr>
+          <w:rFonts w:ascii="Arial" w:hAnsi="Arial" w:cs="Arial"/>
+          <w:b w:val="0"/>
+          <w:i w:val="0"/>
+          <w:sz w:val="24"/>
+        </w:rPr>
+        <w:t>fIPAR: mesura al migdia solar i corba diürna amb ceptòmetre lineal (AccuPAR LP-80) i, en paral·lel, amb imatges hemisfèriques obtingudes amb una càmera d'acció (GoPro), seguint el protocol de Belaid et al. (2025). Aquestes dades serviran per validar la fIPAR derivada del dron.</w:t>
+      </w:r>
+    </w:p>
+    <w:p>
+      <w:pPr>
+        <w:pStyle w:val="ListBullet"/>
+        <w:spacing w:after="120"/>
+        <w:jc w:val="both"/>
+      </w:pPr>
+      <w:r>
+        <w:rPr>
+          <w:rFonts w:ascii="Arial" w:hAnsi="Arial" w:cs="Arial"/>
+          <w:b w:val="0"/>
+          <w:i w:val="0"/>
+          <w:sz w:val="24"/>
+        </w:rPr>
+        <w:t>Potencial hídric de tija (Ψstem): determinat al migdia amb cambra de pressió (Scholander) en fulles prèviament embolcallades amb bossa opaca i reflectora, com a mesura de referència de l'estat hídric (Choné et al., 2001).</w:t>
+      </w:r>
+    </w:p>
+    <w:p>
+      <w:pPr>
+        <w:pStyle w:val="ListBullet"/>
+        <w:spacing w:after="120"/>
+        <w:jc w:val="both"/>
+      </w:pPr>
+      <w:r>
+        <w:rPr>
+          <w:rFonts w:ascii="Arial" w:hAnsi="Arial" w:cs="Arial"/>
+          <w:b w:val="0"/>
+          <w:i w:val="0"/>
+          <w:sz w:val="24"/>
+        </w:rPr>
+        <w:t>Variables meteorològiques: temperatura de l'aire, humitat relativa, dèficit de pressió de vapor (VPD), velocitat del vent i radiació solar, obtingudes de l'estació agrometeorològica més propera de la Xarxa Agrometeorològica de Catalunya (XAC), necessàries com a entrades dels models de balanç energètic.</w:t>
+      </w:r>
+    </w:p>
+    <w:p>
+      <w:pPr>
+        <w:spacing w:after="120" w:before="0"/>
+        <w:jc w:val="left"/>
+      </w:pPr>
+      <w:r>
+        <w:rPr>
+          <w:rFonts w:ascii="Arial" w:hAnsi="Arial" w:cs="Arial"/>
+          <w:b w:val="0"/>
+          <w:i/>
+          <w:color w:val="B00000"/>
+          <w:sz w:val="22"/>
+        </w:rPr>
+        <w:t>[A CONCRETAR] Nombre de ceps mostrejats per tractament i bloc en cada mesura; hores exactes de les corbes diürnes; model de cambra de pressió; identificador i distància de l'estació XAC utilitzada.</w:t>
+      </w:r>
+    </w:p>
+    <w:p>
+      <w:pPr>
+        <w:pStyle w:val="Heading2"/>
+        <w:spacing w:before="240" w:after="160"/>
+      </w:pPr>
+      <w:r>
+        <w:rPr>
+          <w:rFonts w:ascii="Arial" w:hAnsi="Arial" w:cs="Arial"/>
+          <w:b/>
+          <w:i w:val="0"/>
+          <w:sz w:val="26"/>
+        </w:rPr>
+        <w:t>4.6. Models d'evapotranspiració i càlcul del CWSI</w:t>
+      </w:r>
+    </w:p>
+    <w:p>
+      <w:pPr>
+        <w:spacing w:after="120" w:before="0"/>
+      </w:pPr>
+      <w:r>
+        <w:rPr>
+          <w:rFonts w:ascii="Arial" w:hAnsi="Arial" w:cs="Arial"/>
+          <w:b w:val="0"/>
+          <w:i w:val="0"/>
+          <w:sz w:val="24"/>
+        </w:rPr>
+        <w:t>L'evapotranspiració real (ETa) de cada tractament es calcularà amb el model de balanç energètic de dues fonts (TSEB; Norman et al., 1995), que estima els fluxos de calor latent del dosser i del sòl per separat a partir de Tc, Ts, el LAI i les dades meteorològiques. La implementació es farà amb el paquet obert pyTSEB (Nieto i Kustas), tal com s'ha aplicat en fruiters amb imatges de dron (Bellvert et al., 2021). L'evapotranspiració potencial (ETp) s'estimarà amb el model de Shuttleworth–Wallace (Shuttleworth i Wallace, 1985), que descriu l'ET d'una coberta esparsa en condicions sense restricció hídrica a partir de l'estructura real del dosser.</w:t>
+      </w:r>
+    </w:p>
+    <w:p>
+      <w:pPr>
+        <w:spacing w:after="120" w:before="0"/>
+      </w:pPr>
+      <w:r>
+        <w:rPr>
+          <w:rFonts w:ascii="Arial" w:hAnsi="Arial" w:cs="Arial"/>
+          <w:b w:val="0"/>
+          <w:i w:val="0"/>
+          <w:sz w:val="24"/>
+        </w:rPr>
+        <w:t>A partir d'ambdues estimacions, l'índex d'estrès hídric del cultiu es definirà com CWSI = 1 − ETa/ETp (Idso et al., 1981; Jackson et al., 1981), que pren valors propers a 0 en absència d'estrès i propers a 1 en estrès màxim. El CWSI obtingut per teledetecció es contrastarà amb les mesures de Ψstem per avaluar-ne la capacitat de diagnòstic de l'estat hídric (Bellvert et al., 2014).</w:t>
+      </w:r>
+    </w:p>
+    <w:p>
+      <w:pPr>
+        <w:pStyle w:val="Heading2"/>
+        <w:spacing w:before="240" w:after="160"/>
+      </w:pPr>
+      <w:r>
+        <w:rPr>
+          <w:rFonts w:ascii="Arial" w:hAnsi="Arial" w:cs="Arial"/>
+          <w:b/>
+          <w:i w:val="0"/>
+          <w:sz w:val="26"/>
+        </w:rPr>
+        <w:t>4.7. Anàlisi estadística</w:t>
+      </w:r>
+    </w:p>
+    <w:p>
+      <w:pPr>
+        <w:spacing w:after="120" w:before="0"/>
+      </w:pPr>
+      <w:r>
+        <w:rPr>
+          <w:rFonts w:ascii="Arial" w:hAnsi="Arial" w:cs="Arial"/>
+          <w:b w:val="0"/>
+          <w:i w:val="0"/>
+          <w:sz w:val="24"/>
+        </w:rPr>
+        <w:t>L'efecte dels tractaments de poda sobre les variables biofísiques del dosser (LAI, fIPAR, alçada, volum), sobre l'ETa, l'ETp i el CWSI, i sobre el Ψstem s'analitzarà mitjançant una anàlisi de la variància (ANOVA) considerant els factors tractament, data i bloc. Quan l'ANOVA detecti diferències significatives, la separació de mitjanes es farà amb el test HSD de Tukey (p &lt; 0,05), seguint el mateix enfocament aplicat en estudis equivalents en fruiters (Bellvert et al., 2021). La concordança entre els mètodes de mesura de la fIPAR (dron, ceptòmetre i imatge hemisfèrica) i entre el CWSI i el Ψstem s'avaluarà amb regressió lineal i estadístics de bondat d'ajust (coeficient de determinació R², error quadràtic mitjà RMSE i biaix). Es comprovaran prèviament els supòsits de normalitat dels residus i d'homogeneïtat de variàncies.</w:t>
+      </w:r>
+    </w:p>
+    <w:p>
+      <w:pPr>
+        <w:spacing w:after="120" w:before="0"/>
+        <w:jc w:val="left"/>
+      </w:pPr>
+      <w:r>
+        <w:rPr>
+          <w:rFonts w:ascii="Arial" w:hAnsi="Arial" w:cs="Arial"/>
+          <w:b w:val="0"/>
+          <w:i/>
+          <w:color w:val="B00000"/>
+          <w:sz w:val="22"/>
+        </w:rPr>
+        <w:t>[A CONCRETAR] Programari estadístic utilitzat (p. ex., R o JMP) i nivell de significació adoptat si difereix de 0,05.</w:t>
+      </w:r>
+    </w:p>
+    <w:p>
+      <w:pPr>
+        <w:pStyle w:val="Heading1"/>
+        <w:spacing w:before="320" w:after="160"/>
+      </w:pPr>
+      <w:r>
+        <w:rPr>
+          <w:rFonts w:ascii="Arial" w:hAnsi="Arial" w:cs="Arial"/>
+          <w:b/>
+          <w:i w:val="0"/>
+          <w:sz w:val="28"/>
+        </w:rPr>
+        <w:t>5. Resultats</w:t>
+      </w:r>
+    </w:p>
+    <w:p>
+      <w:pPr>
+        <w:spacing w:after="120" w:before="0"/>
+        <w:jc w:val="left"/>
+      </w:pPr>
+      <w:r>
+        <w:rPr>
+          <w:rFonts w:ascii="Arial" w:hAnsi="Arial" w:cs="Arial"/>
+          <w:b w:val="0"/>
+          <w:i/>
+          <w:color w:val="B00000"/>
+          <w:sz w:val="22"/>
+        </w:rPr>
+        <w:t>[CAPÍTOL A OMPLIR AMB LES DADES EXPERIMENTALS REALS] Estructura proposada (afegiu taules i figures a cada apartat):</w:t>
+      </w:r>
+    </w:p>
+    <w:p>
+      <w:pPr>
+        <w:pStyle w:val="Heading2"/>
+        <w:spacing w:before="240" w:after="160"/>
+      </w:pPr>
+      <w:r>
+        <w:rPr>
+          <w:rFonts w:ascii="Arial" w:hAnsi="Arial" w:cs="Arial"/>
+          <w:b/>
+          <w:i w:val="0"/>
+          <w:sz w:val="26"/>
+        </w:rPr>
+        <w:t>5.1. Variables biofísiques del dosser per tractament de poda</w:t>
+      </w:r>
+    </w:p>
+    <w:p>
+      <w:pPr>
+        <w:spacing w:after="120" w:before="0"/>
+        <w:jc w:val="left"/>
+      </w:pPr>
+      <w:r>
+        <w:rPr>
+          <w:rFonts w:ascii="Arial" w:hAnsi="Arial" w:cs="Arial"/>
+          <w:b w:val="0"/>
+          <w:i/>
+          <w:color w:val="B00000"/>
+          <w:sz w:val="22"/>
+        </w:rPr>
+        <w:t>Taules/figures de LAI, fIPAR, alçada i volum per tractament i data; resultats de l'ANOVA i lletres de separació de mitjanes (Tukey).</w:t>
+      </w:r>
+    </w:p>
+    <w:p>
+      <w:pPr>
+        <w:pStyle w:val="Heading2"/>
+        <w:spacing w:before="240" w:after="160"/>
+      </w:pPr>
+      <w:r>
+        <w:rPr>
+          <w:rFonts w:ascii="Arial" w:hAnsi="Arial" w:cs="Arial"/>
+          <w:b/>
+          <w:i w:val="0"/>
+          <w:sz w:val="26"/>
+        </w:rPr>
+        <w:t>5.2. Validació de la fIPAR (dron vs. ceptòmetre vs. imatge hemisfèrica)</w:t>
+      </w:r>
+    </w:p>
+    <w:p>
+      <w:pPr>
+        <w:spacing w:after="120" w:before="0"/>
+        <w:jc w:val="left"/>
+      </w:pPr>
+      <w:r>
+        <w:rPr>
+          <w:rFonts w:ascii="Arial" w:hAnsi="Arial" w:cs="Arial"/>
+          <w:b w:val="0"/>
+          <w:i/>
+          <w:color w:val="B00000"/>
+          <w:sz w:val="22"/>
+        </w:rPr>
+        <w:t>Regressions i estadístics (R², RMSE, biaix) entre els tres mètodes; corbes diürnes de fIPAR.</w:t>
+      </w:r>
+    </w:p>
+    <w:p>
+      <w:pPr>
+        <w:pStyle w:val="Heading2"/>
+        <w:spacing w:before="240" w:after="160"/>
+      </w:pPr>
+      <w:r>
+        <w:rPr>
+          <w:rFonts w:ascii="Arial" w:hAnsi="Arial" w:cs="Arial"/>
+          <w:b/>
+          <w:i w:val="0"/>
+          <w:sz w:val="26"/>
+        </w:rPr>
+        <w:t>5.3. Evapotranspiració (ETa i ETp) per tractament de poda</w:t>
+      </w:r>
+    </w:p>
+    <w:p>
+      <w:pPr>
+        <w:spacing w:after="120" w:before="0"/>
+        <w:jc w:val="left"/>
+      </w:pPr>
+      <w:r>
+        <w:rPr>
+          <w:rFonts w:ascii="Arial" w:hAnsi="Arial" w:cs="Arial"/>
+          <w:b w:val="0"/>
+          <w:i/>
+          <w:color w:val="B00000"/>
+          <w:sz w:val="22"/>
+        </w:rPr>
+        <w:t>Valors d'ETa i ETp estimats amb TSEB i S–W per tractament i data; partició transpiració/evaporació; resultats de l'ANOVA.</w:t>
+      </w:r>
+    </w:p>
+    <w:p>
+      <w:pPr>
+        <w:pStyle w:val="Heading2"/>
+        <w:spacing w:before="240" w:after="160"/>
+      </w:pPr>
+      <w:r>
+        <w:rPr>
+          <w:rFonts w:ascii="Arial" w:hAnsi="Arial" w:cs="Arial"/>
+          <w:b/>
+          <w:i w:val="0"/>
+          <w:sz w:val="26"/>
+        </w:rPr>
+        <w:t>5.4. Índex d'estrès hídric (CWSI) i relació amb el Ψstem</w:t>
+      </w:r>
+    </w:p>
+    <w:p>
+      <w:pPr>
+        <w:spacing w:after="120" w:before="0"/>
+        <w:jc w:val="left"/>
+      </w:pPr>
+      <w:r>
+        <w:rPr>
+          <w:rFonts w:ascii="Arial" w:hAnsi="Arial" w:cs="Arial"/>
+          <w:b w:val="0"/>
+          <w:i/>
+          <w:color w:val="B00000"/>
+          <w:sz w:val="22"/>
+        </w:rPr>
+        <w:t>CWSI per tractament; regressió CWSI–Ψstem; mapes d'estrès hídric.</w:t>
+      </w:r>
+    </w:p>
+    <w:p>
+      <w:pPr>
+        <w:pStyle w:val="Heading1"/>
+        <w:spacing w:before="320" w:after="160"/>
+      </w:pPr>
+      <w:r>
+        <w:rPr>
+          <w:rFonts w:ascii="Arial" w:hAnsi="Arial" w:cs="Arial"/>
+          <w:b/>
+          <w:i w:val="0"/>
+          <w:sz w:val="28"/>
+        </w:rPr>
+        <w:t>6. Discussió</w:t>
+      </w:r>
+    </w:p>
+    <w:p>
+      <w:pPr>
+        <w:spacing w:after="120" w:before="0"/>
+        <w:jc w:val="left"/>
+      </w:pPr>
+      <w:r>
+        <w:rPr>
+          <w:rFonts w:ascii="Arial" w:hAnsi="Arial" w:cs="Arial"/>
+          <w:b w:val="0"/>
+          <w:i/>
+          <w:color w:val="B00000"/>
+          <w:sz w:val="22"/>
+        </w:rPr>
+        <w:t>[CAPÍTOL A OMPLIR] Interpreteu els resultats a la llum de la literatura (Bellvert et al., 2014, 2021; Belaid et al., 2025; Choné et al., 2001). Discutiu: (i) com la poda modifica el dosser i l'ET; (ii) la fiabilitat de la fIPAR per imatge hemisfèrica respecte del ceptòmetre; (iii) la coherència entre CWSI i Ψstem; (iv) limitacions i implicacions per al reg de precisió.</w:t>
+      </w:r>
+    </w:p>
+    <w:p>
+      <w:pPr>
+        <w:pStyle w:val="Heading1"/>
+        <w:spacing w:before="320" w:after="160"/>
+      </w:pPr>
+      <w:r>
+        <w:rPr>
+          <w:rFonts w:ascii="Arial" w:hAnsi="Arial" w:cs="Arial"/>
+          <w:b/>
+          <w:i w:val="0"/>
+          <w:sz w:val="28"/>
+        </w:rPr>
+        <w:t>7. Conclusions</w:t>
+      </w:r>
+    </w:p>
+    <w:p>
+      <w:pPr>
+        <w:spacing w:after="120" w:before="0"/>
+        <w:jc w:val="left"/>
+      </w:pPr>
+      <w:r>
+        <w:rPr>
+          <w:rFonts w:ascii="Arial" w:hAnsi="Arial" w:cs="Arial"/>
+          <w:b w:val="0"/>
+          <w:i/>
+          <w:color w:val="B00000"/>
+          <w:sz w:val="22"/>
+        </w:rPr>
+        <w:t>[CAPÍTOL A OMPLIR] Conclusions numerades que responguin directament als objectius i contrastin les hipòtesis H1–H4, més una conclusió pràctica sobre quina estratègia de poda optimitza l'ús de l'aigua en vinya.</w:t>
       </w:r>
     </w:p>
     <w:p>

</xml_diff>

<commit_message>
TFM: afegir 5 figures originals, 3 taules, índex de figures/taules i ampliar contingut
Incorpora figures pròpies (esquema TSEB, patró diürn de fIPAR, fonament del
CWSI, croquis del disseny en blocs i diagrama de flux metodològic) amb peus
numerats mitjançant camps SEQ i índex automàtic de figures i taules. Afegeix
les taules de tractaments de poda, calendari de vols i entrades/sortides dels
models. Amplia el contingut dels capítols 1, 2 i 4 amb dues referències noves
verificades (Fereres i Soriano, 2007; Kustas i Norman, 1999).

Co-Authored-By: Claude Opus 4.8 <noreply@anthropic.com>
Claude-Session: https://claude.ai/code/session_015S8J5VNEjqUNJtc1c5qPf1
</commit_message>
<xml_diff>
--- a/TFM_Pau_Planes.docx
+++ b/TFM_Pau_Planes.docx
@@ -787,6 +787,64 @@
           <w:i w:val="0"/>
           <w:sz w:val="28"/>
         </w:rPr>
+        <w:t>Índex de figures</w:t>
+      </w:r>
+    </w:p>
+    <w:p>
+      <w:r>
+        <w:fldChar w:fldCharType="begin"/>
+        <w:instrText xml:space="preserve"> TOC \h \z \c "Figura" </w:instrText>
+        <w:fldChar w:fldCharType="separate"/>
+        <w:t>Actualitzeu els camps (clic dret → «Actualitza els camps») per generar la llista.</w:t>
+        <w:fldChar w:fldCharType="end"/>
+      </w:r>
+    </w:p>
+    <w:p>
+      <w:pPr>
+        <w:spacing w:after="240" w:before="0"/>
+      </w:pPr>
+    </w:p>
+    <w:p>
+      <w:pPr>
+        <w:pStyle w:val="Heading1"/>
+        <w:spacing w:before="320" w:after="160"/>
+      </w:pPr>
+      <w:r>
+        <w:rPr>
+          <w:rFonts w:ascii="Arial" w:hAnsi="Arial" w:cs="Arial"/>
+          <w:b/>
+          <w:i w:val="0"/>
+          <w:sz w:val="28"/>
+        </w:rPr>
+        <w:t>Índex de taules</w:t>
+      </w:r>
+    </w:p>
+    <w:p>
+      <w:r>
+        <w:fldChar w:fldCharType="begin"/>
+        <w:instrText xml:space="preserve"> TOC \h \z \c "Taula" </w:instrText>
+        <w:fldChar w:fldCharType="separate"/>
+        <w:t>Actualitzeu els camps (clic dret → «Actualitza els camps») per generar la llista.</w:t>
+        <w:fldChar w:fldCharType="end"/>
+      </w:r>
+    </w:p>
+    <w:p>
+      <w:r>
+        <w:br w:type="page"/>
+      </w:r>
+    </w:p>
+    <w:p>
+      <w:pPr>
+        <w:pStyle w:val="Heading1"/>
+        <w:spacing w:before="320" w:after="160"/>
+      </w:pPr>
+      <w:r>
+        <w:rPr>
+          <w:rFonts w:ascii="Arial" w:hAnsi="Arial" w:cs="Arial"/>
+          <w:b/>
+          <w:i w:val="0"/>
+          <w:sz w:val="28"/>
+        </w:rPr>
         <w:t>Llista d'abreviatures i símbols</w:t>
       </w:r>
     </w:p>
@@ -1364,6 +1422,20 @@
     </w:p>
     <w:p>
       <w:pPr>
+        <w:spacing w:after="120" w:before="0"/>
+      </w:pPr>
+      <w:r>
+        <w:rPr>
+          <w:rFonts w:ascii="Arial" w:hAnsi="Arial" w:cs="Arial"/>
+          <w:b w:val="0"/>
+          <w:i w:val="0"/>
+          <w:sz w:val="24"/>
+        </w:rPr>
+        <w:t>El reg deficitari es defineix com l'aplicació d'aigua per sota dels requeriments complets d'evapotranspiració del cultiu, amb l'objectiu de reduir el consum d'aigua amb una penalització mínima —o fins i tot un benefici— sobre la qualitat de la collita (Fereres i Soriano, 2007). En vinya, aquesta estratègia és especialment efectiva perquè un cert nivell de dèficit hídric controlat afavoreix l'acumulació de compostos fenòlics i la concentració del most. Tanmateix, l'aplicació de reg deficitari de manera precisa exigeix conèixer, parcel·la a parcel·la, tant l'evapotranspiració real del cultiu com el grau d'estrès al qual està sotmesa la planta; és precisament aquesta necessitat la que justifica l'aproximació metodològica d'aquest treball.</w:t>
+      </w:r>
+    </w:p>
+    <w:p>
+      <w:pPr>
         <w:pStyle w:val="Heading2"/>
         <w:spacing w:before="240" w:after="160"/>
       </w:pPr>
@@ -1402,7 +1474,91 @@
           <w:i w:val="0"/>
           <w:sz w:val="24"/>
         </w:rPr>
-        <w:t>Físicament, l'ET és un terme del balanç d'energia de la superfície: la radiació neta (Rn) es reparteix entre el flux de calor al sòl (G), el flux de calor sensible (H) i el flux de calor latent (LE), aquest últim equivalent a l'energia consumida en evapotranspirar (Rn = G + H + LE). Els models de teledetecció basats en el balanç energètic estimen LE com a residu, després de calcular Rn, G i H a partir de la temperatura de la superfície i de dades meteorològiques (Norman et al., 1995).</w:t>
+        <w:t>Físicament, l'ET és un terme del balanç d'energia de la superfície: la radiació neta (Rn) es reparteix entre el flux de calor al sòl (G), el flux de calor sensible (H) i el flux de calor latent (LE), aquest últim equivalent a l'energia consumida en evapotranspirar (Rn = G + H + LE). Els models de teledetecció basats en el balanç energètic estimen LE com a residu, després de calcular Rn, G i H a partir de la temperatura de la superfície i de dades meteorològiques (Norman et al., 1995). La Figura 1 resumeix esquemàticament aquest balanç i la partició dels fluxos entre el sòl i la vegetació en què es basa el model emprat en aquest treball.</w:t>
+      </w:r>
+    </w:p>
+    <w:p>
+      <w:pPr>
+        <w:spacing w:before="160" w:after="40"/>
+        <w:jc w:val="center"/>
+      </w:pPr>
+      <w:r>
+        <w:drawing>
+          <wp:inline xmlns:a="http://schemas.openxmlformats.org/drawingml/2006/main" xmlns:pic="http://schemas.openxmlformats.org/drawingml/2006/picture">
+            <wp:extent cx="4860000" cy="3071465"/>
+            <wp:docPr id="1" name="Picture 1"/>
+            <wp:cNvGraphicFramePr>
+              <a:graphicFrameLocks noChangeAspect="1"/>
+            </wp:cNvGraphicFramePr>
+            <a:graphic>
+              <a:graphicData uri="http://schemas.openxmlformats.org/drawingml/2006/picture">
+                <pic:pic>
+                  <pic:nvPicPr>
+                    <pic:cNvPr id="0" name="fig1_tseb.png"/>
+                    <pic:cNvPicPr/>
+                  </pic:nvPicPr>
+                  <pic:blipFill>
+                    <a:blip r:embed="rId9"/>
+                    <a:stretch>
+                      <a:fillRect/>
+                    </a:stretch>
+                  </pic:blipFill>
+                  <pic:spPr>
+                    <a:xfrm>
+                      <a:off x="0" y="0"/>
+                      <a:ext cx="4860000" cy="3071465"/>
+                    </a:xfrm>
+                    <a:prstGeom prst="rect"/>
+                  </pic:spPr>
+                </pic:pic>
+              </a:graphicData>
+            </a:graphic>
+          </wp:inline>
+        </w:drawing>
+      </w:r>
+    </w:p>
+    <w:p>
+      <w:pPr>
+        <w:pStyle w:val="Caption"/>
+        <w:jc w:val="center"/>
+      </w:pPr>
+      <w:r>
+        <w:rPr>
+          <w:rFonts w:ascii="Arial" w:hAnsi="Arial" w:cs="Arial"/>
+          <w:b/>
+          <w:i w:val="0"/>
+          <w:sz w:val="20"/>
+        </w:rPr>
+        <w:t xml:space="preserve">Figura </w:t>
+      </w:r>
+      <w:r>
+        <w:rPr>
+          <w:rFonts w:ascii="Arial" w:hAnsi="Arial" w:cs="Arial"/>
+          <w:b/>
+          <w:i w:val="0"/>
+          <w:sz w:val="20"/>
+        </w:rPr>
+        <w:fldChar w:fldCharType="begin"/>
+        <w:instrText xml:space="preserve"> SEQ Figura \* ARABIC </w:instrText>
+        <w:fldChar w:fldCharType="end"/>
+      </w:r>
+      <w:r>
+        <w:rPr>
+          <w:rFonts w:ascii="Arial" w:hAnsi="Arial" w:cs="Arial"/>
+          <w:b w:val="0"/>
+          <w:i w:val="0"/>
+          <w:sz w:val="20"/>
+        </w:rPr>
+        <w:t xml:space="preserve">. Esquema del balanç d'energia de la superfície i de la partició de fluxos entre el sòl i el dosser en què es fonamenta el model de balanç energètic de dues fonts (TSEB). Rn: radiació neta; G: flux de calor al sòl; H: calor sensible; LE: calor latent (LEc del dosser i LEs del sòl); Tc i Ts: temperatures de dosser i de sòl. </w:t>
+      </w:r>
+      <w:r>
+        <w:rPr>
+          <w:rFonts w:ascii="Arial" w:hAnsi="Arial" w:cs="Arial"/>
+          <w:b w:val="0"/>
+          <w:i/>
+          <w:sz w:val="20"/>
+        </w:rPr>
+        <w:t>Font: elaboració pròpia a partir de Norman et al. (1995) i Kustas i Norman (1999).</w:t>
       </w:r>
     </w:p>
     <w:p>
@@ -1431,7 +1587,7 @@
           <w:i w:val="0"/>
           <w:sz w:val="24"/>
         </w:rPr>
-        <w:t>El model de balanç energètic de dues fonts (Two-Source Energy Balance, TSEB), formulat per Norman et al. (1995) i desenvolupat posteriorment per Kustas i Norman, tracta el sòl i la vegetació com dues fonts diferenciades d'energia i de temperatura. A partir de la temperatura radiomètrica de la superfície, l'índex d'àrea foliar i les dades meteorològiques, el TSEB separa la transpiració del dosser de l'evaporació del sòl, fet especialment rellevant en cultius llenyosos en files com la vinya, on el sòl descobert ocupa una fracció important de la superfície. Aquesta capacitat de partició dels fluxos fa del TSEB l'eina de referència per estimar l'ETa en fruiters i vinya mitjançant imatges d'alta resolució de dron (Bellvert et al., 2021). La seva implementació es troba disponible de forma oberta en el paquet pyTSEB (Nieto i Kustas).</w:t>
+        <w:t>El model de balanç energètic de dues fonts (Two-Source Energy Balance, TSEB), formulat per Norman et al. (1995) i desenvolupat posteriorment per Kustas i Norman, tracta el sòl i la vegetació com dues fonts diferenciades d'energia i de temperatura. A partir de la temperatura radiomètrica de la superfície, l'índex d'àrea foliar i les dades meteorològiques, el TSEB separa la transpiració del dosser de l'evaporació del sòl, fet especialment rellevant en cultius llenyosos en files com la vinya, on el sòl descobert ocupa una fracció important de la superfície. Aquesta capacitat de partició dels fluxos fa del TSEB l'eina de referència per estimar l'ETa en fruiters i vinya mitjançant imatges d'alta resolució de dron (Bellvert et al., 2021). La seva implementació es troba disponible de forma oberta en el paquet pyTSEB (Nieto i Kustas). Diverses avaluacions del model han mostrat que les estimacions combinades dels fluxos de calor del sòl i de la vegetació s'ajusten a les observacions amb errors de l'ordre del 20 %, fet que valida la seva aplicació en cobertes amb coberta parcial com els cultius en files (Kustas i Norman, 1999).</w:t>
       </w:r>
     </w:p>
     <w:p>
@@ -1560,7 +1716,91 @@
           <w:i w:val="0"/>
           <w:sz w:val="24"/>
         </w:rPr>
-        <w:t>La mesura de referència de la fIPAR en camp es realitza amb ceptòmetres lineals (p. ex., AccuPAR LP-80), que comparen la radiació PAR per sobre i per sota del dosser. No obstant això, la mesura puntual al migdia solar no captura la variació diürna de la interceptació de llum, que en cultius en files depèn fortament de l'orientació de les fileres, de la geometria del dosser i de l'angle solar. Per superar aquesta limitació, Belaid et al. (2025) han proposat i validat un mètode basat en imatges hemisfèriques obtingudes amb una càmera d'acció de baix cost (GoPro), que reconstrueix la corba diürna de fIPAR i el seu valor integrat diari amb un elevat grau d'acord respecte del ceptòmetre. Aquest mètode operacional i econòmic és especialment atractiu per a la seva aplicació en vinya i fruiters.</w:t>
+        <w:t>La mesura de referència de la fIPAR en camp es realitza amb ceptòmetres lineals (p. ex., AccuPAR LP-80), que comparen la radiació PAR per sobre i per sota del dosser. No obstant això, la mesura puntual al migdia solar no captura la variació diürna de la interceptació de llum, que en cultius en files depèn fortament de l'orientació de les fileres, de la geometria del dosser i de l'angle solar. Per superar aquesta limitació, Belaid et al. (2025) han proposat i validat un mètode basat en imatges hemisfèriques obtingudes amb una càmera d'acció de baix cost (GoPro), que reconstrueix la corba diürna de fIPAR i el seu valor integrat diari amb un elevat grau d'acord respecte del ceptòmetre. Aquest mètode operacional i econòmic és especialment atractiu per a la seva aplicació en vinya i fruiters. La Figura 2 il·lustra per què una única mesura al migdia pot subestimar la interceptació diària de llum en un cultiu en files.</w:t>
+      </w:r>
+    </w:p>
+    <w:p>
+      <w:pPr>
+        <w:spacing w:before="160" w:after="40"/>
+        <w:jc w:val="center"/>
+      </w:pPr>
+      <w:r>
+        <w:drawing>
+          <wp:inline xmlns:a="http://schemas.openxmlformats.org/drawingml/2006/main" xmlns:pic="http://schemas.openxmlformats.org/drawingml/2006/picture">
+            <wp:extent cx="4500000" cy="2745877"/>
+            <wp:docPr id="2" name="Picture 2"/>
+            <wp:cNvGraphicFramePr>
+              <a:graphicFrameLocks noChangeAspect="1"/>
+            </wp:cNvGraphicFramePr>
+            <a:graphic>
+              <a:graphicData uri="http://schemas.openxmlformats.org/drawingml/2006/picture">
+                <pic:pic>
+                  <pic:nvPicPr>
+                    <pic:cNvPr id="0" name="fig2_fipar_diurnal.png"/>
+                    <pic:cNvPicPr/>
+                  </pic:nvPicPr>
+                  <pic:blipFill>
+                    <a:blip r:embed="rId10"/>
+                    <a:stretch>
+                      <a:fillRect/>
+                    </a:stretch>
+                  </pic:blipFill>
+                  <pic:spPr>
+                    <a:xfrm>
+                      <a:off x="0" y="0"/>
+                      <a:ext cx="4500000" cy="2745877"/>
+                    </a:xfrm>
+                    <a:prstGeom prst="rect"/>
+                  </pic:spPr>
+                </pic:pic>
+              </a:graphicData>
+            </a:graphic>
+          </wp:inline>
+        </w:drawing>
+      </w:r>
+    </w:p>
+    <w:p>
+      <w:pPr>
+        <w:pStyle w:val="Caption"/>
+        <w:jc w:val="center"/>
+      </w:pPr>
+      <w:r>
+        <w:rPr>
+          <w:rFonts w:ascii="Arial" w:hAnsi="Arial" w:cs="Arial"/>
+          <w:b/>
+          <w:i w:val="0"/>
+          <w:sz w:val="20"/>
+        </w:rPr>
+        <w:t xml:space="preserve">Figura </w:t>
+      </w:r>
+      <w:r>
+        <w:rPr>
+          <w:rFonts w:ascii="Arial" w:hAnsi="Arial" w:cs="Arial"/>
+          <w:b/>
+          <w:i w:val="0"/>
+          <w:sz w:val="20"/>
+        </w:rPr>
+        <w:fldChar w:fldCharType="begin"/>
+        <w:instrText xml:space="preserve"> SEQ Figura \* ARABIC </w:instrText>
+        <w:fldChar w:fldCharType="end"/>
+      </w:r>
+      <w:r>
+        <w:rPr>
+          <w:rFonts w:ascii="Arial" w:hAnsi="Arial" w:cs="Arial"/>
+          <w:b w:val="0"/>
+          <w:i w:val="0"/>
+          <w:sz w:val="20"/>
+        </w:rPr>
+        <w:t xml:space="preserve">. Patró diürn de la fracció de radiació interceptada (fIPAR) en un cultiu en files. La mesura puntual del ceptòmetre al migdia solar pot diferir del valor diari integrat que recupera la imatge hemisfèrica al llarg del dia. </w:t>
+      </w:r>
+      <w:r>
+        <w:rPr>
+          <w:rFonts w:ascii="Arial" w:hAnsi="Arial" w:cs="Arial"/>
+          <w:b w:val="0"/>
+          <w:i/>
+          <w:sz w:val="20"/>
+        </w:rPr>
+        <w:t>Font: elaboració pròpia a partir de Belaid et al. (2025).</w:t>
       </w:r>
     </w:p>
     <w:p>
@@ -1594,6 +1834,20 @@
     </w:p>
     <w:p>
       <w:pPr>
+        <w:spacing w:after="120" w:before="0"/>
+      </w:pPr>
+      <w:r>
+        <w:rPr>
+          <w:rFonts w:ascii="Arial" w:hAnsi="Arial" w:cs="Arial"/>
+          <w:b w:val="0"/>
+          <w:i w:val="0"/>
+          <w:sz w:val="24"/>
+        </w:rPr>
+        <w:t>A més de l'efecte directe sobre la mida del dosser, el sistema de poda determina la distribució espacial de la fusta i del fullatge i, per tant, la geometria de la intercepció de la llum al llarg del dia. Aquesta dimensió temporal —difícil de capturar amb mesures puntuals— reforça l'interès de combinar la teledetecció instantània amb dron amb la caracterització de la corba diürna de fIPAR descrita a l'apartat anterior, de manera que es pugui relacionar de forma robusta l'arquitectura del dosser de cada tractament amb el seu consum real d'aigua.</w:t>
+      </w:r>
+    </w:p>
+    <w:p>
+      <w:pPr>
         <w:pStyle w:val="Heading2"/>
         <w:spacing w:before="240" w:after="160"/>
       </w:pPr>
@@ -1618,7 +1872,91 @@
           <w:i w:val="0"/>
           <w:sz w:val="24"/>
         </w:rPr>
-        <w:t>L'índex d'estrès hídric del cultiu (Crop Water Stress Index, CWSI) va ser proposat per Idso et al. (1981) i Jackson et al. (1981) a partir de la diferència entre la temperatura del dosser i la de l'aire, normalitzada pel dèficit de pressió de vapor. Conceptualment, el CWSI es pot expressar com 1 − ETa/ETp, de manera que pren valors propers a 0 quan el cultiu transpira sense restriccions i propers a 1 en condicions d'estrès màxim. Quan s'estima a partir d'imatges tèrmiques d'alta resolució, el CWSI s'ha correlacionat estretament amb l'estat hídric de la planta en vinya (Bellvert et al., 2014).</w:t>
+        <w:t>L'índex d'estrès hídric del cultiu (Crop Water Stress Index, CWSI) va ser proposat per Idso et al. (1981) i Jackson et al. (1981) a partir de la diferència entre la temperatura del dosser i la de l'aire, normalitzada pel dèficit de pressió de vapor. Conceptualment, el CWSI es pot expressar com 1 − ETa/ETp, de manera que pren valors propers a 0 quan el cultiu transpira sense restriccions i propers a 1 en condicions d'estrès màxim. Quan s'estima a partir d'imatges tèrmiques d'alta resolució, el CWSI s'ha correlacionat estretament amb l'estat hídric de la planta en vinya (Bellvert et al., 2014). El càlcul del CWSI es recolza en dos límits de referència de la diferència entre la temperatura del dosser i la de l'aire en funció del dèficit de pressió de vapor, tal com es mostra a la Figura 3.</w:t>
+      </w:r>
+    </w:p>
+    <w:p>
+      <w:pPr>
+        <w:spacing w:before="160" w:after="40"/>
+        <w:jc w:val="center"/>
+      </w:pPr>
+      <w:r>
+        <w:drawing>
+          <wp:inline xmlns:a="http://schemas.openxmlformats.org/drawingml/2006/main" xmlns:pic="http://schemas.openxmlformats.org/drawingml/2006/picture">
+            <wp:extent cx="4500000" cy="2973338"/>
+            <wp:docPr id="3" name="Picture 3"/>
+            <wp:cNvGraphicFramePr>
+              <a:graphicFrameLocks noChangeAspect="1"/>
+            </wp:cNvGraphicFramePr>
+            <a:graphic>
+              <a:graphicData uri="http://schemas.openxmlformats.org/drawingml/2006/picture">
+                <pic:pic>
+                  <pic:nvPicPr>
+                    <pic:cNvPr id="0" name="fig3_cwsi.png"/>
+                    <pic:cNvPicPr/>
+                  </pic:nvPicPr>
+                  <pic:blipFill>
+                    <a:blip r:embed="rId11"/>
+                    <a:stretch>
+                      <a:fillRect/>
+                    </a:stretch>
+                  </pic:blipFill>
+                  <pic:spPr>
+                    <a:xfrm>
+                      <a:off x="0" y="0"/>
+                      <a:ext cx="4500000" cy="2973338"/>
+                    </a:xfrm>
+                    <a:prstGeom prst="rect"/>
+                  </pic:spPr>
+                </pic:pic>
+              </a:graphicData>
+            </a:graphic>
+          </wp:inline>
+        </w:drawing>
+      </w:r>
+    </w:p>
+    <w:p>
+      <w:pPr>
+        <w:pStyle w:val="Caption"/>
+        <w:jc w:val="center"/>
+      </w:pPr>
+      <w:r>
+        <w:rPr>
+          <w:rFonts w:ascii="Arial" w:hAnsi="Arial" w:cs="Arial"/>
+          <w:b/>
+          <w:i w:val="0"/>
+          <w:sz w:val="20"/>
+        </w:rPr>
+        <w:t xml:space="preserve">Figura </w:t>
+      </w:r>
+      <w:r>
+        <w:rPr>
+          <w:rFonts w:ascii="Arial" w:hAnsi="Arial" w:cs="Arial"/>
+          <w:b/>
+          <w:i w:val="0"/>
+          <w:sz w:val="20"/>
+        </w:rPr>
+        <w:fldChar w:fldCharType="begin"/>
+        <w:instrText xml:space="preserve"> SEQ Figura \* ARABIC </w:instrText>
+        <w:fldChar w:fldCharType="end"/>
+      </w:r>
+      <w:r>
+        <w:rPr>
+          <w:rFonts w:ascii="Arial" w:hAnsi="Arial" w:cs="Arial"/>
+          <w:b w:val="0"/>
+          <w:i w:val="0"/>
+          <w:sz w:val="20"/>
+        </w:rPr>
+        <w:t xml:space="preserve">. Fonament del càlcul de l'índex d'estrès hídric del cultiu (CWSI) a partir de la diferència entre la temperatura del dosser i de l'aire (Tc − Ta) i el dèficit de pressió de vapor (VPD): límit inferior (cultiu ben regat, sense estrès) i límit superior (dosser que no transpira). </w:t>
+      </w:r>
+      <w:r>
+        <w:rPr>
+          <w:rFonts w:ascii="Arial" w:hAnsi="Arial" w:cs="Arial"/>
+          <w:b w:val="0"/>
+          <w:i/>
+          <w:sz w:val="20"/>
+        </w:rPr>
+        <w:t>Font: elaboració pròpia a partir d'Idso et al. (1981) i Jackson et al. (1981).</w:t>
       </w:r>
     </w:p>
     <w:p>
@@ -1900,6 +2238,104 @@
     </w:p>
     <w:p>
       <w:pPr>
+        <w:spacing w:after="120" w:before="0"/>
+      </w:pPr>
+      <w:r>
+        <w:rPr>
+          <w:rFonts w:ascii="Arial" w:hAnsi="Arial" w:cs="Arial"/>
+          <w:b w:val="0"/>
+          <w:i w:val="0"/>
+          <w:sz w:val="24"/>
+        </w:rPr>
+        <w:t>La Figura 4 resumeix el flux de treball metodològic seguit en aquest treball, des de l'adquisició de dades amb dron i en camp fins a l'anàlisi estadística de l'efecte dels tractaments de poda, passant pel processament d'imatges, l'aplicació dels models d'evapotranspiració i la validació. A continuació es descriu cada etapa en detall.</w:t>
+      </w:r>
+    </w:p>
+    <w:p>
+      <w:pPr>
+        <w:spacing w:before="160" w:after="40"/>
+        <w:jc w:val="center"/>
+      </w:pPr>
+      <w:r>
+        <w:drawing>
+          <wp:inline xmlns:a="http://schemas.openxmlformats.org/drawingml/2006/main" xmlns:pic="http://schemas.openxmlformats.org/drawingml/2006/picture">
+            <wp:extent cx="3780000" cy="4379856"/>
+            <wp:docPr id="4" name="Picture 4"/>
+            <wp:cNvGraphicFramePr>
+              <a:graphicFrameLocks noChangeAspect="1"/>
+            </wp:cNvGraphicFramePr>
+            <a:graphic>
+              <a:graphicData uri="http://schemas.openxmlformats.org/drawingml/2006/picture">
+                <pic:pic>
+                  <pic:nvPicPr>
+                    <pic:cNvPr id="0" name="fig5_workflow.png"/>
+                    <pic:cNvPicPr/>
+                  </pic:nvPicPr>
+                  <pic:blipFill>
+                    <a:blip r:embed="rId12"/>
+                    <a:stretch>
+                      <a:fillRect/>
+                    </a:stretch>
+                  </pic:blipFill>
+                  <pic:spPr>
+                    <a:xfrm>
+                      <a:off x="0" y="0"/>
+                      <a:ext cx="3780000" cy="4379856"/>
+                    </a:xfrm>
+                    <a:prstGeom prst="rect"/>
+                  </pic:spPr>
+                </pic:pic>
+              </a:graphicData>
+            </a:graphic>
+          </wp:inline>
+        </w:drawing>
+      </w:r>
+    </w:p>
+    <w:p>
+      <w:pPr>
+        <w:pStyle w:val="Caption"/>
+        <w:jc w:val="center"/>
+      </w:pPr>
+      <w:r>
+        <w:rPr>
+          <w:rFonts w:ascii="Arial" w:hAnsi="Arial" w:cs="Arial"/>
+          <w:b/>
+          <w:i w:val="0"/>
+          <w:sz w:val="20"/>
+        </w:rPr>
+        <w:t xml:space="preserve">Figura </w:t>
+      </w:r>
+      <w:r>
+        <w:rPr>
+          <w:rFonts w:ascii="Arial" w:hAnsi="Arial" w:cs="Arial"/>
+          <w:b/>
+          <w:i w:val="0"/>
+          <w:sz w:val="20"/>
+        </w:rPr>
+        <w:fldChar w:fldCharType="begin"/>
+        <w:instrText xml:space="preserve"> SEQ Figura \* ARABIC </w:instrText>
+        <w:fldChar w:fldCharType="end"/>
+      </w:r>
+      <w:r>
+        <w:rPr>
+          <w:rFonts w:ascii="Arial" w:hAnsi="Arial" w:cs="Arial"/>
+          <w:b w:val="0"/>
+          <w:i w:val="0"/>
+          <w:sz w:val="20"/>
+        </w:rPr>
+        <w:t xml:space="preserve">. Esquema general del flux de treball metodològic del TFM, des de l'adquisició de dades fins a l'anàlisi estadística. </w:t>
+      </w:r>
+      <w:r>
+        <w:rPr>
+          <w:rFonts w:ascii="Arial" w:hAnsi="Arial" w:cs="Arial"/>
+          <w:b w:val="0"/>
+          <w:i/>
+          <w:sz w:val="20"/>
+        </w:rPr>
+        <w:t>Font: elaboració pròpia.</w:t>
+      </w:r>
+    </w:p>
+    <w:p>
+      <w:pPr>
         <w:pStyle w:val="Heading2"/>
         <w:spacing w:before="240" w:after="160"/>
       </w:pPr>
@@ -1969,7 +2405,457 @@
           <w:i w:val="0"/>
           <w:sz w:val="24"/>
         </w:rPr>
-        <w:t>L'assaig s'estableix segons un disseny en blocs complets a l'atzar amb tres tractaments de poda i tres repeticions (blocs) per tractament, de manera que cada combinació tractament × bloc constitueix una parcel·la elemental amb un nombre definit de ceps de mostreig. Aquesta estructura permet controlar la variabilitat espacial del sòl dins la parcel·la i analitzar estadísticament l'efecte del tractament.</w:t>
+        <w:t>L'assaig s'estableix segons un disseny en blocs complets a l'atzar amb tres tractaments de poda i tres repeticions (blocs) per tractament, de manera que cada combinació tractament × bloc constitueix una parcel·la elemental amb un nombre definit de ceps de mostreig. Aquesta estructura permet controlar la variabilitat espacial del sòl dins la parcel·la i analitzar estadísticament l'efecte del tractament. Els tres tractaments de poda previstos es descriuen a la Taula 1 i la distribució dels blocs a la parcel·la es representa a la Figura 5.</w:t>
+      </w:r>
+    </w:p>
+    <w:p>
+      <w:pPr>
+        <w:pStyle w:val="Caption"/>
+        <w:jc w:val="left"/>
+      </w:pPr>
+      <w:r>
+        <w:rPr>
+          <w:rFonts w:ascii="Arial" w:hAnsi="Arial" w:cs="Arial"/>
+          <w:b/>
+          <w:i w:val="0"/>
+          <w:sz w:val="20"/>
+        </w:rPr>
+        <w:t xml:space="preserve">Taula </w:t>
+      </w:r>
+      <w:r>
+        <w:rPr>
+          <w:rFonts w:ascii="Arial" w:hAnsi="Arial" w:cs="Arial"/>
+          <w:b/>
+          <w:i w:val="0"/>
+          <w:sz w:val="20"/>
+        </w:rPr>
+        <w:fldChar w:fldCharType="begin"/>
+        <w:instrText xml:space="preserve"> SEQ Taula \* ARABIC </w:instrText>
+        <w:fldChar w:fldCharType="end"/>
+      </w:r>
+      <w:r>
+        <w:rPr>
+          <w:rFonts w:ascii="Arial" w:hAnsi="Arial" w:cs="Arial"/>
+          <w:b w:val="0"/>
+          <w:i w:val="0"/>
+          <w:sz w:val="20"/>
+        </w:rPr>
+        <w:t xml:space="preserve">. Tractaments de poda de l'assaig (proposta; els valors de càrrega de gemmes s'han de concretar segons el protocol de l'IRTA). </w:t>
+      </w:r>
+    </w:p>
+    <w:tbl>
+      <w:tblPr>
+        <w:tblStyle w:val="TableGrid"/>
+        <w:tblW w:type="auto" w:w="0"/>
+        <w:jc w:val="center"/>
+        <w:tblLook w:firstColumn="1" w:firstRow="1" w:lastColumn="0" w:lastRow="0" w:noHBand="0" w:noVBand="1" w:val="04A0"/>
+      </w:tblPr>
+      <w:tblGrid>
+        <w:gridCol w:w="2351"/>
+        <w:gridCol w:w="2351"/>
+        <w:gridCol w:w="2351"/>
+        <w:gridCol w:w="2351"/>
+      </w:tblGrid>
+      <w:tr>
+        <w:tc>
+          <w:tcPr>
+            <w:tcW w:type="dxa" w:w="850"/>
+          </w:tcPr>
+          <w:p>
+            <w:pPr>
+              <w:jc w:val="center"/>
+            </w:pPr>
+            <w:r>
+              <w:rPr>
+                <w:rFonts w:ascii="Arial" w:hAnsi="Arial" w:cs="Arial"/>
+                <w:b/>
+                <w:i w:val="0"/>
+                <w:sz w:val="21"/>
+              </w:rPr>
+              <w:t>Codi</w:t>
+            </w:r>
+          </w:p>
+        </w:tc>
+        <w:tc>
+          <w:tcPr>
+            <w:tcW w:type="dxa" w:w="2268"/>
+          </w:tcPr>
+          <w:p>
+            <w:pPr>
+              <w:jc w:val="center"/>
+            </w:pPr>
+            <w:r>
+              <w:rPr>
+                <w:rFonts w:ascii="Arial" w:hAnsi="Arial" w:cs="Arial"/>
+                <w:b/>
+                <w:i w:val="0"/>
+                <w:sz w:val="21"/>
+              </w:rPr>
+              <w:t>Tractament</w:t>
+            </w:r>
+          </w:p>
+        </w:tc>
+        <w:tc>
+          <w:tcPr>
+            <w:tcW w:type="dxa" w:w="3685"/>
+          </w:tcPr>
+          <w:p>
+            <w:pPr>
+              <w:jc w:val="center"/>
+            </w:pPr>
+            <w:r>
+              <w:rPr>
+                <w:rFonts w:ascii="Arial" w:hAnsi="Arial" w:cs="Arial"/>
+                <w:b/>
+                <w:i w:val="0"/>
+                <w:sz w:val="21"/>
+              </w:rPr>
+              <w:t>Descripció</w:t>
+            </w:r>
+          </w:p>
+        </w:tc>
+        <w:tc>
+          <w:tcPr>
+            <w:tcW w:type="dxa" w:w="1701"/>
+          </w:tcPr>
+          <w:p>
+            <w:pPr>
+              <w:jc w:val="center"/>
+            </w:pPr>
+            <w:r>
+              <w:rPr>
+                <w:rFonts w:ascii="Arial" w:hAnsi="Arial" w:cs="Arial"/>
+                <w:b/>
+                <w:i w:val="0"/>
+                <w:sz w:val="21"/>
+              </w:rPr>
+              <w:t>Càrrega (gemmes/cep)</w:t>
+            </w:r>
+          </w:p>
+        </w:tc>
+      </w:tr>
+      <w:tr>
+        <w:tc>
+          <w:tcPr>
+            <w:tcW w:type="dxa" w:w="850"/>
+          </w:tcPr>
+          <w:p>
+            <w:pPr>
+              <w:jc w:val="left"/>
+            </w:pPr>
+            <w:r>
+              <w:rPr>
+                <w:rFonts w:ascii="Arial" w:hAnsi="Arial" w:cs="Arial"/>
+                <w:b w:val="0"/>
+                <w:i w:val="0"/>
+                <w:sz w:val="21"/>
+              </w:rPr>
+              <w:t>T1</w:t>
+            </w:r>
+          </w:p>
+        </w:tc>
+        <w:tc>
+          <w:tcPr>
+            <w:tcW w:type="dxa" w:w="2268"/>
+          </w:tcPr>
+          <w:p>
+            <w:pPr>
+              <w:jc w:val="left"/>
+            </w:pPr>
+            <w:r>
+              <w:rPr>
+                <w:rFonts w:ascii="Arial" w:hAnsi="Arial" w:cs="Arial"/>
+                <w:b w:val="0"/>
+                <w:i w:val="0"/>
+                <w:sz w:val="21"/>
+              </w:rPr>
+              <w:t>Poda llarga (Guyot)</w:t>
+            </w:r>
+          </w:p>
+        </w:tc>
+        <w:tc>
+          <w:tcPr>
+            <w:tcW w:type="dxa" w:w="3685"/>
+          </w:tcPr>
+          <w:p>
+            <w:pPr>
+              <w:jc w:val="left"/>
+            </w:pPr>
+            <w:r>
+              <w:rPr>
+                <w:rFonts w:ascii="Arial" w:hAnsi="Arial" w:cs="Arial"/>
+                <w:b w:val="0"/>
+                <w:i w:val="0"/>
+                <w:sz w:val="21"/>
+              </w:rPr>
+              <w:t>Vares llargues; major nombre de gemmes i fullatge</w:t>
+            </w:r>
+          </w:p>
+        </w:tc>
+        <w:tc>
+          <w:tcPr>
+            <w:tcW w:type="dxa" w:w="1701"/>
+          </w:tcPr>
+          <w:p>
+            <w:pPr>
+              <w:jc w:val="left"/>
+            </w:pPr>
+            <w:r>
+              <w:rPr>
+                <w:rFonts w:ascii="Arial" w:hAnsi="Arial" w:cs="Arial"/>
+                <w:b w:val="0"/>
+                <w:i w:val="0"/>
+                <w:sz w:val="21"/>
+              </w:rPr>
+              <w:t>[a concretar]</w:t>
+            </w:r>
+          </w:p>
+        </w:tc>
+      </w:tr>
+      <w:tr>
+        <w:tc>
+          <w:tcPr>
+            <w:tcW w:type="dxa" w:w="850"/>
+          </w:tcPr>
+          <w:p>
+            <w:pPr>
+              <w:jc w:val="left"/>
+            </w:pPr>
+            <w:r>
+              <w:rPr>
+                <w:rFonts w:ascii="Arial" w:hAnsi="Arial" w:cs="Arial"/>
+                <w:b w:val="0"/>
+                <w:i w:val="0"/>
+                <w:sz w:val="21"/>
+              </w:rPr>
+              <w:t>T2</w:t>
+            </w:r>
+          </w:p>
+        </w:tc>
+        <w:tc>
+          <w:tcPr>
+            <w:tcW w:type="dxa" w:w="2268"/>
+          </w:tcPr>
+          <w:p>
+            <w:pPr>
+              <w:jc w:val="left"/>
+            </w:pPr>
+            <w:r>
+              <w:rPr>
+                <w:rFonts w:ascii="Arial" w:hAnsi="Arial" w:cs="Arial"/>
+                <w:b w:val="0"/>
+                <w:i w:val="0"/>
+                <w:sz w:val="21"/>
+              </w:rPr>
+              <w:t>Poda curta (cordó Royat)</w:t>
+            </w:r>
+          </w:p>
+        </w:tc>
+        <w:tc>
+          <w:tcPr>
+            <w:tcW w:type="dxa" w:w="3685"/>
+          </w:tcPr>
+          <w:p>
+            <w:pPr>
+              <w:jc w:val="left"/>
+            </w:pPr>
+            <w:r>
+              <w:rPr>
+                <w:rFonts w:ascii="Arial" w:hAnsi="Arial" w:cs="Arial"/>
+                <w:b w:val="0"/>
+                <w:i w:val="0"/>
+                <w:sz w:val="21"/>
+              </w:rPr>
+              <w:t>Esperons curts sobre cordó permanent; càrrega intermèdia</w:t>
+            </w:r>
+          </w:p>
+        </w:tc>
+        <w:tc>
+          <w:tcPr>
+            <w:tcW w:type="dxa" w:w="1701"/>
+          </w:tcPr>
+          <w:p>
+            <w:pPr>
+              <w:jc w:val="left"/>
+            </w:pPr>
+            <w:r>
+              <w:rPr>
+                <w:rFonts w:ascii="Arial" w:hAnsi="Arial" w:cs="Arial"/>
+                <w:b w:val="0"/>
+                <w:i w:val="0"/>
+                <w:sz w:val="21"/>
+              </w:rPr>
+              <w:t>[a concretar]</w:t>
+            </w:r>
+          </w:p>
+        </w:tc>
+      </w:tr>
+      <w:tr>
+        <w:tc>
+          <w:tcPr>
+            <w:tcW w:type="dxa" w:w="850"/>
+          </w:tcPr>
+          <w:p>
+            <w:pPr>
+              <w:jc w:val="left"/>
+            </w:pPr>
+            <w:r>
+              <w:rPr>
+                <w:rFonts w:ascii="Arial" w:hAnsi="Arial" w:cs="Arial"/>
+                <w:b w:val="0"/>
+                <w:i w:val="0"/>
+                <w:sz w:val="21"/>
+              </w:rPr>
+              <w:t>T3</w:t>
+            </w:r>
+          </w:p>
+        </w:tc>
+        <w:tc>
+          <w:tcPr>
+            <w:tcW w:type="dxa" w:w="2268"/>
+          </w:tcPr>
+          <w:p>
+            <w:pPr>
+              <w:jc w:val="left"/>
+            </w:pPr>
+            <w:r>
+              <w:rPr>
+                <w:rFonts w:ascii="Arial" w:hAnsi="Arial" w:cs="Arial"/>
+                <w:b w:val="0"/>
+                <w:i w:val="0"/>
+                <w:sz w:val="21"/>
+              </w:rPr>
+              <w:t>Poda mínima</w:t>
+            </w:r>
+          </w:p>
+        </w:tc>
+        <w:tc>
+          <w:tcPr>
+            <w:tcW w:type="dxa" w:w="3685"/>
+          </w:tcPr>
+          <w:p>
+            <w:pPr>
+              <w:jc w:val="left"/>
+            </w:pPr>
+            <w:r>
+              <w:rPr>
+                <w:rFonts w:ascii="Arial" w:hAnsi="Arial" w:cs="Arial"/>
+                <w:b w:val="0"/>
+                <w:i w:val="0"/>
+                <w:sz w:val="21"/>
+              </w:rPr>
+              <w:t>Intervenció mínima; dosser dens però poc estructurat</w:t>
+            </w:r>
+          </w:p>
+        </w:tc>
+        <w:tc>
+          <w:tcPr>
+            <w:tcW w:type="dxa" w:w="1701"/>
+          </w:tcPr>
+          <w:p>
+            <w:pPr>
+              <w:jc w:val="left"/>
+            </w:pPr>
+            <w:r>
+              <w:rPr>
+                <w:rFonts w:ascii="Arial" w:hAnsi="Arial" w:cs="Arial"/>
+                <w:b w:val="0"/>
+                <w:i w:val="0"/>
+                <w:sz w:val="21"/>
+              </w:rPr>
+              <w:t>[a concretar]</w:t>
+            </w:r>
+          </w:p>
+        </w:tc>
+      </w:tr>
+    </w:tbl>
+    <w:p>
+      <w:pPr>
+        <w:spacing w:after="80"/>
+      </w:pPr>
+    </w:p>
+    <w:p>
+      <w:pPr>
+        <w:spacing w:before="160" w:after="40"/>
+        <w:jc w:val="center"/>
+      </w:pPr>
+      <w:r>
+        <w:drawing>
+          <wp:inline xmlns:a="http://schemas.openxmlformats.org/drawingml/2006/main" xmlns:pic="http://schemas.openxmlformats.org/drawingml/2006/picture">
+            <wp:extent cx="4680000" cy="2541818"/>
+            <wp:docPr id="5" name="Picture 5"/>
+            <wp:cNvGraphicFramePr>
+              <a:graphicFrameLocks noChangeAspect="1"/>
+            </wp:cNvGraphicFramePr>
+            <a:graphic>
+              <a:graphicData uri="http://schemas.openxmlformats.org/drawingml/2006/picture">
+                <pic:pic>
+                  <pic:nvPicPr>
+                    <pic:cNvPr id="0" name="fig4_disseny.png"/>
+                    <pic:cNvPicPr/>
+                  </pic:nvPicPr>
+                  <pic:blipFill>
+                    <a:blip r:embed="rId13"/>
+                    <a:stretch>
+                      <a:fillRect/>
+                    </a:stretch>
+                  </pic:blipFill>
+                  <pic:spPr>
+                    <a:xfrm>
+                      <a:off x="0" y="0"/>
+                      <a:ext cx="4680000" cy="2541818"/>
+                    </a:xfrm>
+                    <a:prstGeom prst="rect"/>
+                  </pic:spPr>
+                </pic:pic>
+              </a:graphicData>
+            </a:graphic>
+          </wp:inline>
+        </w:drawing>
+      </w:r>
+    </w:p>
+    <w:p>
+      <w:pPr>
+        <w:pStyle w:val="Caption"/>
+        <w:jc w:val="center"/>
+      </w:pPr>
+      <w:r>
+        <w:rPr>
+          <w:rFonts w:ascii="Arial" w:hAnsi="Arial" w:cs="Arial"/>
+          <w:b/>
+          <w:i w:val="0"/>
+          <w:sz w:val="20"/>
+        </w:rPr>
+        <w:t xml:space="preserve">Figura </w:t>
+      </w:r>
+      <w:r>
+        <w:rPr>
+          <w:rFonts w:ascii="Arial" w:hAnsi="Arial" w:cs="Arial"/>
+          <w:b/>
+          <w:i w:val="0"/>
+          <w:sz w:val="20"/>
+        </w:rPr>
+        <w:fldChar w:fldCharType="begin"/>
+        <w:instrText xml:space="preserve"> SEQ Figura \* ARABIC </w:instrText>
+        <w:fldChar w:fldCharType="end"/>
+      </w:r>
+      <w:r>
+        <w:rPr>
+          <w:rFonts w:ascii="Arial" w:hAnsi="Arial" w:cs="Arial"/>
+          <w:b w:val="0"/>
+          <w:i w:val="0"/>
+          <w:sz w:val="20"/>
+        </w:rPr>
+        <w:t xml:space="preserve">. Croquis del disseny experimental en blocs complets a l'atzar amb tres tractaments de poda (T1, T2, T3) i tres blocs. </w:t>
+      </w:r>
+      <w:r>
+        <w:rPr>
+          <w:rFonts w:ascii="Arial" w:hAnsi="Arial" w:cs="Arial"/>
+          <w:b w:val="0"/>
+          <w:i/>
+          <w:sz w:val="20"/>
+        </w:rPr>
+        <w:t>Font: elaboració pròpia.</w:t>
       </w:r>
     </w:p>
     <w:p>
@@ -1985,7 +2871,7 @@
           <w:color w:val="B00000"/>
           <w:sz w:val="22"/>
         </w:rPr>
-        <w:t>[A CONCRETAR] Definició exacta dels tres tractaments de poda (p. ex., poda llarga tipus Guyot, poda curta en cordó Royat i poda mínima), nombre de gemmes deixades en cada cas, nombre de ceps per parcel·la elemental i esquema/croquis de la distribució dels blocs a la parcel·la (Figura).</w:t>
+        <w:t>[A CONCRETAR] Definició exacta dels tractaments (confirmar sistemes i nombre de gemmes), nombre de ceps per parcel·la elemental i dimensions/orientació reals dels blocs a la parcel·la.</w:t>
       </w:r>
     </w:p>
     <w:p>
@@ -2014,8 +2900,374 @@
           <w:i w:val="0"/>
           <w:sz w:val="24"/>
         </w:rPr>
-        <w:t>Es realitzaran tres vols de dron al voltant del migdia solar en tres moments del cicle vegetatiu —brotació, tancament del raïm (proximitat a floració/quallat) i verol— per capturar la dinàmica estacional del dosser i de l'estat hídric. El dron anirà equipat amb dues càmeres: (i) una càmera multiespectral de sis bandes, incloent-hi la regió del red-edge, per al càlcul d'índexs de vegetació i l'estimació de LAI i fIPAR; i (ii) una càmera tèrmica per a l'obtenció de la temperatura de la superfície. Els vols es planificaran amb un solapament frontal i lateral elevat per garantir una bona reconstrucció fotogramètrica, i s'inclouran panells de calibratge radiomètric i punts de control terrestre georeferenciats.</w:t>
+        <w:t>Es realitzaran tres vols de dron al voltant del migdia solar en tres moments del cicle vegetatiu —brotació, tancament del raïm (proximitat a floració/quallat) i verol— per capturar la dinàmica estacional del dosser i de l'estat hídric. El dron anirà equipat amb dues càmeres: (i) una càmera multiespectral de sis bandes, incloent-hi la regió del red-edge, per al càlcul d'índexs de vegetació i l'estimació de LAI i fIPAR; i (ii) una càmera tèrmica per a l'obtenció de la temperatura de la superfície. Els vols es planificaran amb un solapament frontal i lateral elevat per garantir una bona reconstrucció fotogramètrica, i s'inclouran panells de calibratge radiomètric i punts de control terrestre georeferenciats. El calendari previst de vols i de mesures de camp associades es resumeix a la Taula 2.</w:t>
       </w:r>
+    </w:p>
+    <w:p>
+      <w:pPr>
+        <w:pStyle w:val="Caption"/>
+        <w:jc w:val="left"/>
+      </w:pPr>
+      <w:r>
+        <w:rPr>
+          <w:rFonts w:ascii="Arial" w:hAnsi="Arial" w:cs="Arial"/>
+          <w:b/>
+          <w:i w:val="0"/>
+          <w:sz w:val="20"/>
+        </w:rPr>
+        <w:t xml:space="preserve">Taula </w:t>
+      </w:r>
+      <w:r>
+        <w:rPr>
+          <w:rFonts w:ascii="Arial" w:hAnsi="Arial" w:cs="Arial"/>
+          <w:b/>
+          <w:i w:val="0"/>
+          <w:sz w:val="20"/>
+        </w:rPr>
+        <w:fldChar w:fldCharType="begin"/>
+        <w:instrText xml:space="preserve"> SEQ Taula \* ARABIC </w:instrText>
+        <w:fldChar w:fldCharType="end"/>
+      </w:r>
+      <w:r>
+        <w:rPr>
+          <w:rFonts w:ascii="Arial" w:hAnsi="Arial" w:cs="Arial"/>
+          <w:b w:val="0"/>
+          <w:i w:val="0"/>
+          <w:sz w:val="20"/>
+        </w:rPr>
+        <w:t xml:space="preserve">. Calendari previst de vols de dron i mesures de camp simultànies segons la fase fenològica de la vinya. </w:t>
+      </w:r>
+    </w:p>
+    <w:tbl>
+      <w:tblPr>
+        <w:tblStyle w:val="TableGrid"/>
+        <w:tblW w:type="auto" w:w="0"/>
+        <w:jc w:val="center"/>
+        <w:tblLook w:firstColumn="1" w:firstRow="1" w:lastColumn="0" w:lastRow="0" w:noHBand="0" w:noVBand="1" w:val="04A0"/>
+      </w:tblPr>
+      <w:tblGrid>
+        <w:gridCol w:w="2351"/>
+        <w:gridCol w:w="2351"/>
+        <w:gridCol w:w="2351"/>
+        <w:gridCol w:w="2351"/>
+      </w:tblGrid>
+      <w:tr>
+        <w:tc>
+          <w:tcPr>
+            <w:tcW w:type="dxa" w:w="737"/>
+          </w:tcPr>
+          <w:p>
+            <w:pPr>
+              <w:jc w:val="center"/>
+            </w:pPr>
+            <w:r>
+              <w:rPr>
+                <w:rFonts w:ascii="Arial" w:hAnsi="Arial" w:cs="Arial"/>
+                <w:b/>
+                <w:i w:val="0"/>
+                <w:sz w:val="21"/>
+              </w:rPr>
+              <w:t>Vol</w:t>
+            </w:r>
+          </w:p>
+        </w:tc>
+        <w:tc>
+          <w:tcPr>
+            <w:tcW w:type="dxa" w:w="2268"/>
+          </w:tcPr>
+          <w:p>
+            <w:pPr>
+              <w:jc w:val="center"/>
+            </w:pPr>
+            <w:r>
+              <w:rPr>
+                <w:rFonts w:ascii="Arial" w:hAnsi="Arial" w:cs="Arial"/>
+                <w:b/>
+                <w:i w:val="0"/>
+                <w:sz w:val="21"/>
+              </w:rPr>
+              <w:t>Fase fenològica</w:t>
+            </w:r>
+          </w:p>
+        </w:tc>
+        <w:tc>
+          <w:tcPr>
+            <w:tcW w:type="dxa" w:w="2268"/>
+          </w:tcPr>
+          <w:p>
+            <w:pPr>
+              <w:jc w:val="center"/>
+            </w:pPr>
+            <w:r>
+              <w:rPr>
+                <w:rFonts w:ascii="Arial" w:hAnsi="Arial" w:cs="Arial"/>
+                <w:b/>
+                <w:i w:val="0"/>
+                <w:sz w:val="21"/>
+              </w:rPr>
+              <w:t>Període aproximat</w:t>
+            </w:r>
+          </w:p>
+        </w:tc>
+        <w:tc>
+          <w:tcPr>
+            <w:tcW w:type="dxa" w:w="3231"/>
+          </w:tcPr>
+          <w:p>
+            <w:pPr>
+              <w:jc w:val="center"/>
+            </w:pPr>
+            <w:r>
+              <w:rPr>
+                <w:rFonts w:ascii="Arial" w:hAnsi="Arial" w:cs="Arial"/>
+                <w:b/>
+                <w:i w:val="0"/>
+                <w:sz w:val="21"/>
+              </w:rPr>
+              <w:t>Mesures de camp simultànies</w:t>
+            </w:r>
+          </w:p>
+        </w:tc>
+      </w:tr>
+      <w:tr>
+        <w:tc>
+          <w:tcPr>
+            <w:tcW w:type="dxa" w:w="737"/>
+          </w:tcPr>
+          <w:p>
+            <w:pPr>
+              <w:jc w:val="left"/>
+            </w:pPr>
+            <w:r>
+              <w:rPr>
+                <w:rFonts w:ascii="Arial" w:hAnsi="Arial" w:cs="Arial"/>
+                <w:b w:val="0"/>
+                <w:i w:val="0"/>
+                <w:sz w:val="21"/>
+              </w:rPr>
+              <w:t>1</w:t>
+            </w:r>
+          </w:p>
+        </w:tc>
+        <w:tc>
+          <w:tcPr>
+            <w:tcW w:type="dxa" w:w="2268"/>
+          </w:tcPr>
+          <w:p>
+            <w:pPr>
+              <w:jc w:val="left"/>
+            </w:pPr>
+            <w:r>
+              <w:rPr>
+                <w:rFonts w:ascii="Arial" w:hAnsi="Arial" w:cs="Arial"/>
+                <w:b w:val="0"/>
+                <w:i w:val="0"/>
+                <w:sz w:val="21"/>
+              </w:rPr>
+              <w:t>Brotació</w:t>
+            </w:r>
+          </w:p>
+        </w:tc>
+        <w:tc>
+          <w:tcPr>
+            <w:tcW w:type="dxa" w:w="2268"/>
+          </w:tcPr>
+          <w:p>
+            <w:pPr>
+              <w:jc w:val="left"/>
+            </w:pPr>
+            <w:r>
+              <w:rPr>
+                <w:rFonts w:ascii="Arial" w:hAnsi="Arial" w:cs="Arial"/>
+                <w:b w:val="0"/>
+                <w:i w:val="0"/>
+                <w:sz w:val="21"/>
+              </w:rPr>
+              <w:t>[a concretar]</w:t>
+            </w:r>
+          </w:p>
+        </w:tc>
+        <w:tc>
+          <w:tcPr>
+            <w:tcW w:type="dxa" w:w="3231"/>
+          </w:tcPr>
+          <w:p>
+            <w:pPr>
+              <w:jc w:val="left"/>
+            </w:pPr>
+            <w:r>
+              <w:rPr>
+                <w:rFonts w:ascii="Arial" w:hAnsi="Arial" w:cs="Arial"/>
+                <w:b w:val="0"/>
+                <w:i w:val="0"/>
+                <w:sz w:val="21"/>
+              </w:rPr>
+              <w:t>fIPAR (ceptòmetre + GoPro), Ψstem, meteo</w:t>
+            </w:r>
+          </w:p>
+        </w:tc>
+      </w:tr>
+      <w:tr>
+        <w:tc>
+          <w:tcPr>
+            <w:tcW w:type="dxa" w:w="737"/>
+          </w:tcPr>
+          <w:p>
+            <w:pPr>
+              <w:jc w:val="left"/>
+            </w:pPr>
+            <w:r>
+              <w:rPr>
+                <w:rFonts w:ascii="Arial" w:hAnsi="Arial" w:cs="Arial"/>
+                <w:b w:val="0"/>
+                <w:i w:val="0"/>
+                <w:sz w:val="21"/>
+              </w:rPr>
+              <w:t>2</w:t>
+            </w:r>
+          </w:p>
+        </w:tc>
+        <w:tc>
+          <w:tcPr>
+            <w:tcW w:type="dxa" w:w="2268"/>
+          </w:tcPr>
+          <w:p>
+            <w:pPr>
+              <w:jc w:val="left"/>
+            </w:pPr>
+            <w:r>
+              <w:rPr>
+                <w:rFonts w:ascii="Arial" w:hAnsi="Arial" w:cs="Arial"/>
+                <w:b w:val="0"/>
+                <w:i w:val="0"/>
+                <w:sz w:val="21"/>
+              </w:rPr>
+              <w:t>Tancament del raïm</w:t>
+            </w:r>
+          </w:p>
+        </w:tc>
+        <w:tc>
+          <w:tcPr>
+            <w:tcW w:type="dxa" w:w="2268"/>
+          </w:tcPr>
+          <w:p>
+            <w:pPr>
+              <w:jc w:val="left"/>
+            </w:pPr>
+            <w:r>
+              <w:rPr>
+                <w:rFonts w:ascii="Arial" w:hAnsi="Arial" w:cs="Arial"/>
+                <w:b w:val="0"/>
+                <w:i w:val="0"/>
+                <w:sz w:val="21"/>
+              </w:rPr>
+              <w:t>[a concretar]</w:t>
+            </w:r>
+          </w:p>
+        </w:tc>
+        <w:tc>
+          <w:tcPr>
+            <w:tcW w:type="dxa" w:w="3231"/>
+          </w:tcPr>
+          <w:p>
+            <w:pPr>
+              <w:jc w:val="left"/>
+            </w:pPr>
+            <w:r>
+              <w:rPr>
+                <w:rFonts w:ascii="Arial" w:hAnsi="Arial" w:cs="Arial"/>
+                <w:b w:val="0"/>
+                <w:i w:val="0"/>
+                <w:sz w:val="21"/>
+              </w:rPr>
+              <w:t>fIPAR (ceptòmetre + GoPro), Ψstem, meteo</w:t>
+            </w:r>
+          </w:p>
+        </w:tc>
+      </w:tr>
+      <w:tr>
+        <w:tc>
+          <w:tcPr>
+            <w:tcW w:type="dxa" w:w="737"/>
+          </w:tcPr>
+          <w:p>
+            <w:pPr>
+              <w:jc w:val="left"/>
+            </w:pPr>
+            <w:r>
+              <w:rPr>
+                <w:rFonts w:ascii="Arial" w:hAnsi="Arial" w:cs="Arial"/>
+                <w:b w:val="0"/>
+                <w:i w:val="0"/>
+                <w:sz w:val="21"/>
+              </w:rPr>
+              <w:t>3</w:t>
+            </w:r>
+          </w:p>
+        </w:tc>
+        <w:tc>
+          <w:tcPr>
+            <w:tcW w:type="dxa" w:w="2268"/>
+          </w:tcPr>
+          <w:p>
+            <w:pPr>
+              <w:jc w:val="left"/>
+            </w:pPr>
+            <w:r>
+              <w:rPr>
+                <w:rFonts w:ascii="Arial" w:hAnsi="Arial" w:cs="Arial"/>
+                <w:b w:val="0"/>
+                <w:i w:val="0"/>
+                <w:sz w:val="21"/>
+              </w:rPr>
+              <w:t>Verol</w:t>
+            </w:r>
+          </w:p>
+        </w:tc>
+        <w:tc>
+          <w:tcPr>
+            <w:tcW w:type="dxa" w:w="2268"/>
+          </w:tcPr>
+          <w:p>
+            <w:pPr>
+              <w:jc w:val="left"/>
+            </w:pPr>
+            <w:r>
+              <w:rPr>
+                <w:rFonts w:ascii="Arial" w:hAnsi="Arial" w:cs="Arial"/>
+                <w:b w:val="0"/>
+                <w:i w:val="0"/>
+                <w:sz w:val="21"/>
+              </w:rPr>
+              <w:t>[a concretar]</w:t>
+            </w:r>
+          </w:p>
+        </w:tc>
+        <w:tc>
+          <w:tcPr>
+            <w:tcW w:type="dxa" w:w="3231"/>
+          </w:tcPr>
+          <w:p>
+            <w:pPr>
+              <w:jc w:val="left"/>
+            </w:pPr>
+            <w:r>
+              <w:rPr>
+                <w:rFonts w:ascii="Arial" w:hAnsi="Arial" w:cs="Arial"/>
+                <w:b w:val="0"/>
+                <w:i w:val="0"/>
+                <w:sz w:val="21"/>
+              </w:rPr>
+              <w:t>fIPAR (ceptòmetre + GoPro), Ψstem, meteo</w:t>
+            </w:r>
+          </w:p>
+        </w:tc>
+      </w:tr>
+    </w:tbl>
+    <w:p>
+      <w:pPr>
+        <w:spacing w:after="80"/>
+      </w:pPr>
     </w:p>
     <w:p>
       <w:pPr>
@@ -2225,8 +3477,297 @@
           <w:i w:val="0"/>
           <w:sz w:val="24"/>
         </w:rPr>
-        <w:t>A partir d'ambdues estimacions, l'índex d'estrès hídric del cultiu es definirà com CWSI = 1 − ETa/ETp (Idso et al., 1981; Jackson et al., 1981), que pren valors propers a 0 en absència d'estrès i propers a 1 en estrès màxim. El CWSI obtingut per teledetecció es contrastarà amb les mesures de Ψstem per avaluar-ne la capacitat de diagnòstic de l'estat hídric (Bellvert et al., 2014).</w:t>
+        <w:t>A partir d'ambdues estimacions, l'índex d'estrès hídric del cultiu es definirà com CWSI = 1 − ETa/ETp (Idso et al., 1981; Jackson et al., 1981), que pren valors propers a 0 en absència d'estrès i propers a 1 en estrès màxim. El CWSI obtingut per teledetecció es contrastarà amb les mesures de Ψstem per avaluar-ne la capacitat de diagnòstic de l'estat hídric (Bellvert et al., 2014). La Taula 3 resumeix les variables d'entrada i les sortides principals de cada model.</w:t>
       </w:r>
+    </w:p>
+    <w:p>
+      <w:pPr>
+        <w:pStyle w:val="Caption"/>
+        <w:jc w:val="left"/>
+      </w:pPr>
+      <w:r>
+        <w:rPr>
+          <w:rFonts w:ascii="Arial" w:hAnsi="Arial" w:cs="Arial"/>
+          <w:b/>
+          <w:i w:val="0"/>
+          <w:sz w:val="20"/>
+        </w:rPr>
+        <w:t xml:space="preserve">Taula </w:t>
+      </w:r>
+      <w:r>
+        <w:rPr>
+          <w:rFonts w:ascii="Arial" w:hAnsi="Arial" w:cs="Arial"/>
+          <w:b/>
+          <w:i w:val="0"/>
+          <w:sz w:val="20"/>
+        </w:rPr>
+        <w:fldChar w:fldCharType="begin"/>
+        <w:instrText xml:space="preserve"> SEQ Taula \* ARABIC </w:instrText>
+        <w:fldChar w:fldCharType="end"/>
+      </w:r>
+      <w:r>
+        <w:rPr>
+          <w:rFonts w:ascii="Arial" w:hAnsi="Arial" w:cs="Arial"/>
+          <w:b w:val="0"/>
+          <w:i w:val="0"/>
+          <w:sz w:val="20"/>
+        </w:rPr>
+        <w:t xml:space="preserve">. Variables d'entrada i sortides principals dels models d'evapotranspiració emprats. </w:t>
+      </w:r>
+    </w:p>
+    <w:tbl>
+      <w:tblPr>
+        <w:tblStyle w:val="TableGrid"/>
+        <w:tblW w:type="auto" w:w="0"/>
+        <w:jc w:val="center"/>
+        <w:tblLook w:firstColumn="1" w:firstRow="1" w:lastColumn="0" w:lastRow="0" w:noHBand="0" w:noVBand="1" w:val="04A0"/>
+      </w:tblPr>
+      <w:tblGrid>
+        <w:gridCol w:w="3135"/>
+        <w:gridCol w:w="3135"/>
+        <w:gridCol w:w="3135"/>
+      </w:tblGrid>
+      <w:tr>
+        <w:tc>
+          <w:tcPr>
+            <w:tcW w:type="dxa" w:w="2154"/>
+          </w:tcPr>
+          <w:p>
+            <w:pPr>
+              <w:jc w:val="center"/>
+            </w:pPr>
+            <w:r>
+              <w:rPr>
+                <w:rFonts w:ascii="Arial" w:hAnsi="Arial" w:cs="Arial"/>
+                <w:b/>
+                <w:i w:val="0"/>
+                <w:sz w:val="21"/>
+              </w:rPr>
+              <w:t>Model</w:t>
+            </w:r>
+          </w:p>
+        </w:tc>
+        <w:tc>
+          <w:tcPr>
+            <w:tcW w:type="dxa" w:w="4365"/>
+          </w:tcPr>
+          <w:p>
+            <w:pPr>
+              <w:jc w:val="center"/>
+            </w:pPr>
+            <w:r>
+              <w:rPr>
+                <w:rFonts w:ascii="Arial" w:hAnsi="Arial" w:cs="Arial"/>
+                <w:b/>
+                <w:i w:val="0"/>
+                <w:sz w:val="21"/>
+              </w:rPr>
+              <w:t>Entrades principals</w:t>
+            </w:r>
+          </w:p>
+        </w:tc>
+        <w:tc>
+          <w:tcPr>
+            <w:tcW w:type="dxa" w:w="1984"/>
+          </w:tcPr>
+          <w:p>
+            <w:pPr>
+              <w:jc w:val="center"/>
+            </w:pPr>
+            <w:r>
+              <w:rPr>
+                <w:rFonts w:ascii="Arial" w:hAnsi="Arial" w:cs="Arial"/>
+                <w:b/>
+                <w:i w:val="0"/>
+                <w:sz w:val="21"/>
+              </w:rPr>
+              <w:t>Sortida principal</w:t>
+            </w:r>
+          </w:p>
+        </w:tc>
+      </w:tr>
+      <w:tr>
+        <w:tc>
+          <w:tcPr>
+            <w:tcW w:type="dxa" w:w="2154"/>
+          </w:tcPr>
+          <w:p>
+            <w:pPr>
+              <w:jc w:val="left"/>
+            </w:pPr>
+            <w:r>
+              <w:rPr>
+                <w:rFonts w:ascii="Arial" w:hAnsi="Arial" w:cs="Arial"/>
+                <w:b w:val="0"/>
+                <w:i w:val="0"/>
+                <w:sz w:val="21"/>
+              </w:rPr>
+              <w:t>TSEB</w:t>
+            </w:r>
+          </w:p>
+        </w:tc>
+        <w:tc>
+          <w:tcPr>
+            <w:tcW w:type="dxa" w:w="4365"/>
+          </w:tcPr>
+          <w:p>
+            <w:pPr>
+              <w:jc w:val="left"/>
+            </w:pPr>
+            <w:r>
+              <w:rPr>
+                <w:rFonts w:ascii="Arial" w:hAnsi="Arial" w:cs="Arial"/>
+                <w:b w:val="0"/>
+                <w:i w:val="0"/>
+                <w:sz w:val="21"/>
+              </w:rPr>
+              <w:t>Tc, Ts, LAI, Rn, dades meteorològiques (Ta, VPD, vent, radiació)</w:t>
+            </w:r>
+          </w:p>
+        </w:tc>
+        <w:tc>
+          <w:tcPr>
+            <w:tcW w:type="dxa" w:w="1984"/>
+          </w:tcPr>
+          <w:p>
+            <w:pPr>
+              <w:jc w:val="left"/>
+            </w:pPr>
+            <w:r>
+              <w:rPr>
+                <w:rFonts w:ascii="Arial" w:hAnsi="Arial" w:cs="Arial"/>
+                <w:b w:val="0"/>
+                <w:i w:val="0"/>
+                <w:sz w:val="21"/>
+              </w:rPr>
+              <w:t>ETa (transpiració + evaporació)</w:t>
+            </w:r>
+          </w:p>
+        </w:tc>
+      </w:tr>
+      <w:tr>
+        <w:tc>
+          <w:tcPr>
+            <w:tcW w:type="dxa" w:w="2154"/>
+          </w:tcPr>
+          <w:p>
+            <w:pPr>
+              <w:jc w:val="left"/>
+            </w:pPr>
+            <w:r>
+              <w:rPr>
+                <w:rFonts w:ascii="Arial" w:hAnsi="Arial" w:cs="Arial"/>
+                <w:b w:val="0"/>
+                <w:i w:val="0"/>
+                <w:sz w:val="21"/>
+              </w:rPr>
+              <w:t>Shuttleworth–Wallace</w:t>
+            </w:r>
+          </w:p>
+        </w:tc>
+        <w:tc>
+          <w:tcPr>
+            <w:tcW w:type="dxa" w:w="4365"/>
+          </w:tcPr>
+          <w:p>
+            <w:pPr>
+              <w:jc w:val="left"/>
+            </w:pPr>
+            <w:r>
+              <w:rPr>
+                <w:rFonts w:ascii="Arial" w:hAnsi="Arial" w:cs="Arial"/>
+                <w:b w:val="0"/>
+                <w:i w:val="0"/>
+                <w:sz w:val="21"/>
+              </w:rPr>
+              <w:t>Estructura del dosser (LAI, alçada), resistències, dades meteorològiques</w:t>
+            </w:r>
+          </w:p>
+        </w:tc>
+        <w:tc>
+          <w:tcPr>
+            <w:tcW w:type="dxa" w:w="1984"/>
+          </w:tcPr>
+          <w:p>
+            <w:pPr>
+              <w:jc w:val="left"/>
+            </w:pPr>
+            <w:r>
+              <w:rPr>
+                <w:rFonts w:ascii="Arial" w:hAnsi="Arial" w:cs="Arial"/>
+                <w:b w:val="0"/>
+                <w:i w:val="0"/>
+                <w:sz w:val="21"/>
+              </w:rPr>
+              <w:t>ETp (sense restricció hídrica)</w:t>
+            </w:r>
+          </w:p>
+        </w:tc>
+      </w:tr>
+      <w:tr>
+        <w:tc>
+          <w:tcPr>
+            <w:tcW w:type="dxa" w:w="2154"/>
+          </w:tcPr>
+          <w:p>
+            <w:pPr>
+              <w:jc w:val="left"/>
+            </w:pPr>
+            <w:r>
+              <w:rPr>
+                <w:rFonts w:ascii="Arial" w:hAnsi="Arial" w:cs="Arial"/>
+                <w:b w:val="0"/>
+                <w:i w:val="0"/>
+                <w:sz w:val="21"/>
+              </w:rPr>
+              <w:t>CWSI</w:t>
+            </w:r>
+          </w:p>
+        </w:tc>
+        <w:tc>
+          <w:tcPr>
+            <w:tcW w:type="dxa" w:w="4365"/>
+          </w:tcPr>
+          <w:p>
+            <w:pPr>
+              <w:jc w:val="left"/>
+            </w:pPr>
+            <w:r>
+              <w:rPr>
+                <w:rFonts w:ascii="Arial" w:hAnsi="Arial" w:cs="Arial"/>
+                <w:b w:val="0"/>
+                <w:i w:val="0"/>
+                <w:sz w:val="21"/>
+              </w:rPr>
+              <w:t>ETa i ETp</w:t>
+            </w:r>
+          </w:p>
+        </w:tc>
+        <w:tc>
+          <w:tcPr>
+            <w:tcW w:type="dxa" w:w="1984"/>
+          </w:tcPr>
+          <w:p>
+            <w:pPr>
+              <w:jc w:val="left"/>
+            </w:pPr>
+            <w:r>
+              <w:rPr>
+                <w:rFonts w:ascii="Arial" w:hAnsi="Arial" w:cs="Arial"/>
+                <w:b w:val="0"/>
+                <w:i w:val="0"/>
+                <w:sz w:val="21"/>
+              </w:rPr>
+              <w:t>Índex d'estrès hídric = 1 − ETa/ETp</w:t>
+            </w:r>
+          </w:p>
+        </w:tc>
+      </w:tr>
+    </w:tbl>
+    <w:p>
+      <w:pPr>
+        <w:spacing w:after="80"/>
+      </w:pPr>
     </w:p>
     <w:p>
       <w:pPr>
@@ -2598,6 +4139,22 @@
           <w:i w:val="0"/>
           <w:sz w:val="24"/>
         </w:rPr>
+        <w:t>Fereres, E., &amp; Soriano, M. A. (2007). Deficit irrigation for reducing agricultural water use. Journal of Experimental Botany, 58(2), 147–159. https://doi.org/10.1093/jxb/erl165</w:t>
+      </w:r>
+    </w:p>
+    <w:p>
+      <w:pPr>
+        <w:spacing w:after="160"/>
+        <w:ind w:left="709" w:hanging="709"/>
+        <w:jc w:val="both"/>
+      </w:pPr>
+      <w:r>
+        <w:rPr>
+          <w:rFonts w:ascii="Arial" w:hAnsi="Arial" w:cs="Arial"/>
+          <w:b w:val="0"/>
+          <w:i w:val="0"/>
+          <w:sz w:val="24"/>
+        </w:rPr>
         <w:t>Idso, S. B., Jackson, R. D., Pinter, P. J., Reginato, R. J., &amp; Hatfield, J. L. (1981). Normalizing the stress-degree-day parameter for environmental variability. Agricultural Meteorology, 24, 45–55. https://doi.org/10.1016/0002-1571(81)90032-7</w:t>
       </w:r>
     </w:p>
@@ -2630,6 +4187,22 @@
           <w:i w:val="0"/>
           <w:sz w:val="24"/>
         </w:rPr>
+        <w:t>Kustas, W. P., &amp; Norman, J. M. (1999). Evaluation of soil and vegetation heat flux predictions using a simple two-source model with radiometric temperatures for partial canopy cover. Agricultural and Forest Meteorology, 94(1), 13–29. https://doi.org/10.1016/S0168-1923(99)00005-2</w:t>
+      </w:r>
+    </w:p>
+    <w:p>
+      <w:pPr>
+        <w:spacing w:after="160"/>
+        <w:ind w:left="709" w:hanging="709"/>
+        <w:jc w:val="both"/>
+      </w:pPr>
+      <w:r>
+        <w:rPr>
+          <w:rFonts w:ascii="Arial" w:hAnsi="Arial" w:cs="Arial"/>
+          <w:b w:val="0"/>
+          <w:i w:val="0"/>
+          <w:sz w:val="24"/>
+        </w:rPr>
         <w:t>Norman, J. M., Kustas, W. P., &amp; Humes, K. S. (1995). Source approach for estimating soil and vegetation energy fluxes in observations of directional radiometric surface temperature. Agricultural and Forest Meteorology, 77(3–4), 263–293. https://doi.org/10.1016/0168-1923(95)02265-Y</w:t>
       </w:r>
     </w:p>
@@ -2650,7 +4223,7 @@
       </w:r>
     </w:p>
     <w:sectPr>
-      <w:footerReference w:type="default" r:id="rId9"/>
+      <w:footerReference w:type="default" r:id="rId14"/>
       <w:pgSz w:w="12240" w:h="15840"/>
       <w:pgMar w:top="1417" w:right="1417" w:bottom="1417" w:left="1417" w:header="720" w:footer="720" w:gutter="0"/>
       <w:cols w:space="720"/>
@@ -3842,13 +5415,15 @@
     <w:qFormat/>
     <w:rsid w:val="00FC693F"/>
     <w:pPr>
-      <w:spacing w:line="240" w:lineRule="auto"/>
+      <w:spacing w:line="240" w:lineRule="auto" w:before="40" w:after="200"/>
     </w:pPr>
     <w:rPr>
-      <w:b/>
+      <w:rFonts w:ascii="Arial" w:hAnsi="Arial"/>
+      <w:b w:val="0"/>
       <w:bCs/>
-      <w:color w:val="4F81BD" w:themeColor="accent1"/>
-      <w:sz w:val="18"/>
+      <w:i w:val="0"/>
+      <w:color w:val="000000"/>
+      <w:sz w:val="20"/>
       <w:szCs w:val="18"/>
     </w:rPr>
   </w:style>

</xml_diff>

<commit_message>
TFM: ajustar al disseny experimental real (assaig ADAPTEX/VITIMPACT, IRTA)
Incorpora les dades reals de l'assaig de l'IRTA a partir del croquis ADAPTEX i
dels resultats Tempranillo 2025: parcel·la Ull de Llebre (Tempranillo/R-110) a
Raimat, doble cordó, plantada el 2013, marc 1,6x2,5 m, reg deficitari
controlat. Actualitza el disseny a 5 tractaments de maneig de capçada
(SE, EL, EM, ES, ES+DV) x 4 blocs = 20 parcel·les de 24 ceps, redibuixa el
croquis, afegeix Kruskal-Wallis a l'anàlisi estadística, connecta la
introducció amb l'assaig de l'IRTA, ajusta hipòtesis i resums (CAT/ES/EN) i
afegeix la referència de l'assaig (Blanco et al., 2025).

Co-Authored-By: Claude Opus 4.8 <noreply@anthropic.com>
Claude-Session: https://claude.ai/code/session_015S8J5VNEjqUNJtc1c5qPf1
</commit_message>
<xml_diff>
--- a/TFM_Pau_Planes.docx
+++ b/TFM_Pau_Planes.docx
@@ -400,7 +400,7 @@
           <w:i w:val="0"/>
           <w:sz w:val="24"/>
         </w:rPr>
-        <w:t>vinya; evapotranspiració; teledetecció; dron; radiació PAR; poda; estrès hídric; reg de precisió</w:t>
+        <w:t>vinya; Tempranillo; evapotranspiració; teledetecció; dron; radiació PAR; maneig de capçada; estrès hídric; reg de precisió</w:t>
       </w:r>
     </w:p>
     <w:p>
@@ -424,7 +424,7 @@
           <w:i w:val="0"/>
           <w:sz w:val="24"/>
         </w:rPr>
-        <w:t>viña; evapotranspiración; teledetección; dron; radiación PAR; poda; estrés hídrico; riego de precisión</w:t>
+        <w:t>viña; Tempranillo; evapotranspiración; teledetección; dron; radiación PAR; manejo de copa; estrés hídrico; riego de precisión</w:t>
       </w:r>
     </w:p>
     <w:p>
@@ -448,7 +448,7 @@
           <w:i w:val="0"/>
           <w:sz w:val="24"/>
         </w:rPr>
-        <w:t>vineyard; evapotranspiration; remote sensing; UAV; PAR radiation; pruning; water stress; precision irrigation</w:t>
+        <w:t>vineyard; Tempranillo; evapotranspiration; remote sensing; UAV; PAR radiation; canopy management; water stress; precision irrigation</w:t>
       </w:r>
     </w:p>
     <w:p>
@@ -532,7 +532,7 @@
           <w:i w:val="0"/>
           <w:sz w:val="24"/>
         </w:rPr>
-        <w:t>Aquest Treball Final de Màster, desenvolupat en col·laboració amb l'IRTA, té com a objectiu avaluar l'efecte de diferents tractaments de poda sobre l'evapotranspiració de la vinya combinant teledetecció d'alta precisió amb dron i mesures de radiació PAR en camp. En una parcel·la experimental amb un disseny en blocs a l'atzar i tres tractaments de poda, es realitzaran tres vols de dron al llarg del cicle vegetatiu amb càmeres tèrmica i multiespectral. A partir de les imatges es derivaran les variables biofísiques del dosser (LAI, fIPAR, alçada i volum) i les temperatures de dosser i de sòl, que alimentaran els models de balanç energètic de dues fonts (TSEB) i de Shuttleworth–Wallace per estimar l'ETa i l'ET potencial. L'índex d'estrès hídric del cultiu (CWSI = 1 − ETa/ETp) es relacionarà amb mesures de potencial hídric de tija (Ψstem), i les estimacions de fIPAR es validaran amb ceptòmetre i amb imatges hemisfèriques de baix cost.</w:t>
+        <w:t>Aquest Treball Final de Màster, desenvolupat en col·laboració amb l'IRTA, té com a objectiu avaluar l'efecte de diferents tractaments de poda sobre l'evapotranspiració de la vinya combinant teledetecció d'alta precisió amb dron i mesures de radiació PAR en camp. En una parcel·la experimental de la varietat 'Ull de Llebre' (Tempranillo) a Raimat, amb un disseny en blocs de cinc tractaments de maneig de capçada i quatre repeticions, es realitzaran tres vols de dron al llarg del cicle vegetatiu amb càmeres tèrmica i multiespectral. A partir de les imatges es derivaran les variables biofísiques del dosser (LAI, fIPAR, alçada i volum) i les temperatures de dosser i de sòl, que alimentaran els models de balanç energètic de dues fonts (TSEB) i de Shuttleworth–Wallace per estimar l'ETa i l'ET potencial. L'índex d'estrès hídric del cultiu (CWSI = 1 − ETa/ETp) es relacionarà amb mesures de potencial hídric de tija (Ψstem), i les estimacions de fIPAR es validaran amb ceptòmetre i amb imatges hemisfèriques de baix cost.</w:t>
       </w:r>
     </w:p>
     <w:p>
@@ -615,7 +615,7 @@
           <w:i w:val="0"/>
           <w:sz w:val="24"/>
         </w:rPr>
-        <w:t>Este Trabajo Final de Máster, desarrollado en colaboración con el IRTA, tiene como objetivo evaluar el efecto de diferentes tratamientos de poda sobre la evapotranspiración de la viña combinando teledetección de alta precisión con dron y medidas de radiación PAR en campo. En una parcela experimental con un diseño en bloques al azar y tres tratamientos de poda, se realizarán tres vuelos de dron a lo largo del ciclo vegetativo con cámaras térmica y multiespectral. A partir de las imágenes se derivarán las variables biofísicas del dosel (LAI, fIPAR, altura y volumen) y las temperaturas de dosel y de suelo, que alimentarán los modelos de balance energético de dos fuentes (TSEB) y de Shuttleworth–Wallace para estimar la ETa y la ET potencial. El índice de estrés hídrico del cultivo (CWSI = 1 − ETa/ETp) se relacionará con medidas de potencial hídrico de tallo (Ψstem), y las estimaciones de fIPAR se validarán con ceptómetro y con imágenes hemisféricas de bajo coste.</w:t>
+        <w:t>Este Trabajo Final de Máster, desarrollado en colaboración con el IRTA, tiene como objetivo evaluar el efecto de diferentes tratamientos de poda sobre la evapotranspiración de la viña combinando teledetección de alta precisión con dron y medidas de radiación PAR en campo. En una parcela experimental de la variedad 'Tempranillo' en Raimat, con un diseño en bloques de cinco tratamientos de manejo de copa y cuatro repeticiones, se realizarán tres vuelos de dron a lo largo del ciclo vegetativo con cámaras térmica y multiespectral. A partir de las imágenes se derivarán las variables biofísicas del dosel (LAI, fIPAR, altura y volumen) y las temperaturas de dosel y de suelo, que alimentarán los modelos de balance energético de dos fuentes (TSEB) y de Shuttleworth–Wallace para estimar la ETa y la ET potencial. El índice de estrés hídrico del cultivo (CWSI = 1 − ETa/ETp) se relacionará con medidas de potencial hídrico de tallo (Ψstem), y las estimaciones de fIPAR se validarán con ceptómetro y con imágenes hemisféricas de bajo coste.</w:t>
       </w:r>
     </w:p>
     <w:p>
@@ -698,7 +698,7 @@
           <w:i w:val="0"/>
           <w:sz w:val="24"/>
         </w:rPr>
-        <w:t>This Master's Thesis, carried out in collaboration with IRTA, aims to assess the effect of different pruning treatments on vineyard evapotranspiration by combining high-resolution UAV remote sensing and field PAR measurements. In an experimental plot with a randomised block design and three pruning treatments, three UAV flights will be performed over the growing season with thermal and multispectral cameras. Canopy biophysical variables (LAI, fIPAR, height and volume) and canopy and soil temperatures will be derived from the imagery and used to drive the two-source energy balance (TSEB) and Shuttleworth–Wallace models to estimate ETa and potential ET. The crop water stress index (CWSI = 1 − ETa/ETp) will be related to stem water potential (Ψstem) measurements, and fIPAR estimates will be validated against a ceptometer and low-cost hemispherical imaging.</w:t>
+        <w:t>This Master's Thesis, carried out in collaboration with IRTA, aims to assess the effect of different pruning treatments on vineyard evapotranspiration by combining high-resolution UAV remote sensing and field PAR measurements. In an experimental 'Tempranillo' plot in Raimat, with a block design of five canopy-management treatments and four replicates, three UAV flights will be performed over the growing season with thermal and multispectral cameras. Canopy biophysical variables (LAI, fIPAR, height and volume) and canopy and soil temperatures will be derived from the imagery and used to drive the two-source energy balance (TSEB) and Shuttleworth–Wallace models to estimate ETa and potential ET. The crop water stress index (CWSI = 1 − ETa/ETp) will be related to stem water potential (Ψstem) measurements, and fIPAR estimates will be validated against a ceptometer and low-cost hemispherical imaging.</w:t>
       </w:r>
     </w:p>
     <w:p>
@@ -1345,6 +1345,20 @@
           <w:sz w:val="24"/>
         </w:rPr>
         <w:t>Estudis recents han demostrat la viabilitat d'estimar l'ETa en cultius llenyosos combinant imatges tèrmiques i multiespectrals d'alta resolució obtingudes amb dron amb el model de balanç energètic de dues fonts (TSEB), que separa la transpiració del dosser de l'evaporació del sòl (Bellvert et al., 2021). Paral·lelament, s'han proposat metodologies de baix cost basades en imatges hemisfèriques per mesurar la fracció de radiació fotosintèticament activa interceptada (fIPAR) al llarg del dia, com a alternativa pràctica al ceptòmetre tradicional (Belaid et al., 2025). Aquest treball, desenvolupat en col·laboració amb l'IRTA, integra ambdós enfocaments per estudiar com els tractaments de poda modifiquen l'ET de la vinya.</w:t>
+      </w:r>
+    </w:p>
+    <w:p>
+      <w:pPr>
+        <w:spacing w:after="120" w:before="0"/>
+      </w:pPr>
+      <w:r>
+        <w:rPr>
+          <w:rFonts w:ascii="Arial" w:hAnsi="Arial" w:cs="Arial"/>
+          <w:b w:val="0"/>
+          <w:i w:val="0"/>
+          <w:sz w:val="24"/>
+        </w:rPr>
+        <w:t>Concretament, el treball s'emmarca en l'assaig de maneig de capçada que el Programa d'Ús Eficient de l'Aigua de l'IRTA desenvolupa en una parcel·la de la varietat 'Ull de Llebre' (Tempranillo) a Raimat, dins dels projectes VITIMPACT i ADAPTEX, amb l'objectiu d'augmentar la resiliència de la vinya davant del canvi climàtic. En aquest assaig, cinc nivells d'esporga generen capçades de mides contrastades i, en campanyes anteriors, s'han observat diferències notables en el consum d'aigua de reg entre tractaments —les capçades més grans han arribat a consumir fins a un 14 % més d'aigua que el maneig comercial, mentre que l'esporga severa l'ha reduït prop d'un 20 %. El present TFM aborda precisament una de les línies de treball futures previstes en aquest assaig: la quantificació de la transpiració i de l'evapotranspiració mitjançant teledetecció, com a complement a les mesures directes de flux de saba i de potencial hídric.</w:t>
       </w:r>
     </w:p>
     <w:p>
@@ -2146,7 +2160,7 @@
           <w:i w:val="0"/>
           <w:sz w:val="24"/>
         </w:rPr>
-        <w:t xml:space="preserve"> Els tractaments de poda generen diferències significatives en les variables biofísiques del dosser (LAI, fIPAR, alçada i volum), detectables amb teledetecció d'alta resolució amb dron.</w:t>
+        <w:t xml:space="preserve"> Els cinc tractaments de maneig de capçada generen diferències significatives en les variables biofísiques del dosser (LAI, fIPAR, alçada i volum), detectables amb teledetecció d'alta resolució amb dron.</w:t>
       </w:r>
     </w:p>
     <w:p>
@@ -2170,7 +2184,7 @@
           <w:i w:val="0"/>
           <w:sz w:val="24"/>
         </w:rPr>
-        <w:t xml:space="preserve"> Els tractaments amb major vigor i volum de dosser presenten valors més elevats d'ETa, en ser més gran la superfície foliar transpirant i la radiació interceptada.</w:t>
+        <w:t xml:space="preserve"> Els tractaments amb major mida de capçada (SE, sense esporga) presenten valors més elevats d'ETa, mentre que els d'esporga severa (ES i ES+DV) en presenten de més baixos, en consonància amb les diferències de consum d'aigua de reg observades en campanyes anteriors de l'assaig.</w:t>
       </w:r>
     </w:p>
     <w:p>
@@ -2194,7 +2208,7 @@
           <w:i w:val="0"/>
           <w:sz w:val="24"/>
         </w:rPr>
-        <w:t xml:space="preserve"> Les podes més restrictives augmenten el CWSI (major estrès hídric relatiu) i es tradueixen en valors de Ψstem més negatius.</w:t>
+        <w:t xml:space="preserve"> En mantenir-se un mateix estat hídric entre tractaments mitjançant reg individualitzat, les diferències d'ETa i de CWSI s'expliquen principalment per l'arquitectura del dosser i no per diferències de Ψstem imposades.</w:t>
       </w:r>
     </w:p>
     <w:p>
@@ -2360,7 +2374,21 @@
           <w:i w:val="0"/>
           <w:sz w:val="24"/>
         </w:rPr>
-        <w:t>L'estudi es durà a terme en una parcel·la experimental de vinya gestionada per l'IRTA. La parcel·la es conrea seguint les pràctiques habituals de la zona, amb un sistema de reg localitzat per degoteig que permet aplicar tractaments de reg controlats.</w:t>
+        <w:t>L'estudi s'emmarca en l'assaig de maneig de capçada de la vinya que el Programa d'Ús Eficient de l'Aigua de l'IRTA desenvolupa en el marc dels projectes VITIMPACT i ADAPTEX, orientat a augmentar la resiliència del cultiu davant del canvi climàtic. La parcel·la experimental se situa a Raimat (comarca del Segrià, Lleida) i està plantada amb la varietat 'Ull de Llebre' (Tempranillo) empeltada sobre el portaempelt Richter 110 (R-110).</w:t>
+      </w:r>
+    </w:p>
+    <w:p>
+      <w:pPr>
+        <w:spacing w:after="120" w:before="0"/>
+      </w:pPr>
+      <w:r>
+        <w:rPr>
+          <w:rFonts w:ascii="Arial" w:hAnsi="Arial" w:cs="Arial"/>
+          <w:b w:val="0"/>
+          <w:i w:val="0"/>
+          <w:sz w:val="24"/>
+        </w:rPr>
+        <w:t>La vinya, plantada l'any 2013, es condueix en doble cordó amb un marc de plantació d'1,6 m entre ceps i 2,5 m entre fileres. El reg s'aplica per degoteig seguint una estratègia de reg deficitari controlat (RDC), amb imposició del dèficit en el període post-verolat fins a la verema. Un aspecte clau del disseny és que cada tractament de maneig de capçada es rega de manera individualitzada per mantenir tots els tractaments en un mateix estat hídric, independentment de la mida de la capçada; d'aquesta manera, les diferències observades es poden atribuir a l'arquitectura del dosser i no a diferències d'estat hídric imposades. El potencial hídric de tija al migdia s'utilitza com a indicador de referència per controlar aquest estat hídric (Choné et al., 2001).</w:t>
       </w:r>
     </w:p>
     <w:p>
@@ -2376,7 +2404,7 @@
           <w:color w:val="B00000"/>
           <w:sz w:val="22"/>
         </w:rPr>
-        <w:t>[A CONCRETAR AMB DADES DE LA FINCA] Localitat i coordenades de la parcel·la; varietat i portaempelt; any de plantació; marc de plantació (distància entre fileres i entre ceps); orientació de les fileres; sistema de conducció (espatllera vertical, etc.); tipus de sòl i característiques edafoclimàtiques; règim de reg aplicat.</w:t>
+        <w:t>[VERIFICAR/COMPLETAR] Coordenades exactes de la parcel·la, tipus de sòl i dades climàtiques de la campanya (p. ex., precipitació acumulada; el 2024-25 va ser de ~330 mm), i dotacions de reg reals d'aquesta temporada.</w:t>
       </w:r>
     </w:p>
     <w:p>
@@ -2405,7 +2433,7 @@
           <w:i w:val="0"/>
           <w:sz w:val="24"/>
         </w:rPr>
-        <w:t>L'assaig s'estableix segons un disseny en blocs complets a l'atzar amb tres tractaments de poda i tres repeticions (blocs) per tractament, de manera que cada combinació tractament × bloc constitueix una parcel·la elemental amb un nombre definit de ceps de mostreig. Aquesta estructura permet controlar la variabilitat espacial del sòl dins la parcel·la i analitzar estadísticament l'efecte del tractament. Els tres tractaments de poda previstos es descriuen a la Taula 1 i la distribució dels blocs a la parcel·la es representa a la Figura 5.</w:t>
+        <w:t>L'assaig segueix un disseny en blocs amb cinc tractaments de maneig de capçada (esporga) i quatre repeticions (blocs) per tractament, fet que dona lloc a 20 parcel·les experimentals. Cada parcel·la elemental està formada per 24 ceps distribuïts en tres fileres de vuit ceps, dels quals es prenen com a ceps de mostreig els centrals per minimitzar els efectes de vora. Els cinc tractaments es descriuen a la Taula 1 i la distribució dels blocs a la parcel·la es representa a la Figura 5.</w:t>
       </w:r>
     </w:p>
     <w:p>
@@ -2440,7 +2468,7 @@
           <w:i w:val="0"/>
           <w:sz w:val="20"/>
         </w:rPr>
-        <w:t xml:space="preserve">. Tractaments de poda de l'assaig (proposta; els valors de càrrega de gemmes s'han de concretar segons el protocol de l'IRTA). </w:t>
+        <w:t xml:space="preserve">. Tractaments de maneig de capçada (esporga) de l'assaig ADAPTEX. El tractament EM (esporga mitjana) correspon a la pràctica comercial de referència. </w:t>
       </w:r>
     </w:p>
     <w:tbl>
@@ -2451,15 +2479,14 @@
         <w:tblLook w:firstColumn="1" w:firstRow="1" w:lastColumn="0" w:lastRow="0" w:noHBand="0" w:noVBand="1" w:val="04A0"/>
       </w:tblPr>
       <w:tblGrid>
-        <w:gridCol w:w="2351"/>
-        <w:gridCol w:w="2351"/>
-        <w:gridCol w:w="2351"/>
-        <w:gridCol w:w="2351"/>
+        <w:gridCol w:w="3135"/>
+        <w:gridCol w:w="3135"/>
+        <w:gridCol w:w="3135"/>
       </w:tblGrid>
       <w:tr>
         <w:tc>
           <w:tcPr>
-            <w:tcW w:type="dxa" w:w="850"/>
+            <w:tcW w:type="dxa" w:w="907"/>
           </w:tcPr>
           <w:p>
             <w:pPr>
@@ -2478,7 +2505,7 @@
         </w:tc>
         <w:tc>
           <w:tcPr>
-            <w:tcW w:type="dxa" w:w="2268"/>
+            <w:tcW w:type="dxa" w:w="2608"/>
           </w:tcPr>
           <w:p>
             <w:pPr>
@@ -2497,7 +2524,7 @@
         </w:tc>
         <w:tc>
           <w:tcPr>
-            <w:tcW w:type="dxa" w:w="3685"/>
+            <w:tcW w:type="dxa" w:w="3855"/>
           </w:tcPr>
           <w:p>
             <w:pPr>
@@ -2514,30 +2541,11 @@
             </w:r>
           </w:p>
         </w:tc>
-        <w:tc>
-          <w:tcPr>
-            <w:tcW w:type="dxa" w:w="1701"/>
-          </w:tcPr>
-          <w:p>
-            <w:pPr>
-              <w:jc w:val="center"/>
-            </w:pPr>
-            <w:r>
-              <w:rPr>
-                <w:rFonts w:ascii="Arial" w:hAnsi="Arial" w:cs="Arial"/>
-                <w:b/>
-                <w:i w:val="0"/>
-                <w:sz w:val="21"/>
-              </w:rPr>
-              <w:t>Càrrega (gemmes/cep)</w:t>
-            </w:r>
-          </w:p>
-        </w:tc>
       </w:tr>
       <w:tr>
         <w:tc>
           <w:tcPr>
-            <w:tcW w:type="dxa" w:w="850"/>
+            <w:tcW w:type="dxa" w:w="907"/>
           </w:tcPr>
           <w:p>
             <w:pPr>
@@ -2550,13 +2558,13 @@
                 <w:i w:val="0"/>
                 <w:sz w:val="21"/>
               </w:rPr>
-              <w:t>T1</w:t>
+              <w:t>SE</w:t>
             </w:r>
           </w:p>
         </w:tc>
         <w:tc>
           <w:tcPr>
-            <w:tcW w:type="dxa" w:w="2268"/>
+            <w:tcW w:type="dxa" w:w="2608"/>
           </w:tcPr>
           <w:p>
             <w:pPr>
@@ -2569,13 +2577,13 @@
                 <w:i w:val="0"/>
                 <w:sz w:val="21"/>
               </w:rPr>
-              <w:t>Poda llarga (Guyot)</w:t>
+              <w:t>Sense esporga</w:t>
             </w:r>
           </w:p>
         </w:tc>
         <w:tc>
           <w:tcPr>
-            <w:tcW w:type="dxa" w:w="3685"/>
+            <w:tcW w:type="dxa" w:w="3855"/>
           </w:tcPr>
           <w:p>
             <w:pPr>
@@ -2588,13 +2596,15 @@
                 <w:i w:val="0"/>
                 <w:sz w:val="21"/>
               </w:rPr>
-              <w:t>Vares llargues; major nombre de gemmes i fullatge</w:t>
+              <w:t>No s'elimina vegetació; capçada de mida màxima</w:t>
             </w:r>
           </w:p>
         </w:tc>
+      </w:tr>
+      <w:tr>
         <w:tc>
           <w:tcPr>
-            <w:tcW w:type="dxa" w:w="1701"/>
+            <w:tcW w:type="dxa" w:w="907"/>
           </w:tcPr>
           <w:p>
             <w:pPr>
@@ -2607,15 +2617,13 @@
                 <w:i w:val="0"/>
                 <w:sz w:val="21"/>
               </w:rPr>
-              <w:t>[a concretar]</w:t>
+              <w:t>EL</w:t>
             </w:r>
           </w:p>
         </w:tc>
-      </w:tr>
-      <w:tr>
         <w:tc>
           <w:tcPr>
-            <w:tcW w:type="dxa" w:w="850"/>
+            <w:tcW w:type="dxa" w:w="2608"/>
           </w:tcPr>
           <w:p>
             <w:pPr>
@@ -2628,13 +2636,13 @@
                 <w:i w:val="0"/>
                 <w:sz w:val="21"/>
               </w:rPr>
-              <w:t>T2</w:t>
+              <w:t>Esporga lleugera</w:t>
             </w:r>
           </w:p>
         </w:tc>
         <w:tc>
           <w:tcPr>
-            <w:tcW w:type="dxa" w:w="2268"/>
+            <w:tcW w:type="dxa" w:w="3855"/>
           </w:tcPr>
           <w:p>
             <w:pPr>
@@ -2647,13 +2655,15 @@
                 <w:i w:val="0"/>
                 <w:sz w:val="21"/>
               </w:rPr>
-              <w:t>Poda curta (cordó Royat)</w:t>
+              <w:t>Reducció lleugera de la capçada</w:t>
             </w:r>
           </w:p>
         </w:tc>
+      </w:tr>
+      <w:tr>
         <w:tc>
           <w:tcPr>
-            <w:tcW w:type="dxa" w:w="3685"/>
+            <w:tcW w:type="dxa" w:w="907"/>
           </w:tcPr>
           <w:p>
             <w:pPr>
@@ -2666,13 +2676,13 @@
                 <w:i w:val="0"/>
                 <w:sz w:val="21"/>
               </w:rPr>
-              <w:t>Esperons curts sobre cordó permanent; càrrega intermèdia</w:t>
+              <w:t>EM</w:t>
             </w:r>
           </w:p>
         </w:tc>
         <w:tc>
           <w:tcPr>
-            <w:tcW w:type="dxa" w:w="1701"/>
+            <w:tcW w:type="dxa" w:w="2608"/>
           </w:tcPr>
           <w:p>
             <w:pPr>
@@ -2685,15 +2695,13 @@
                 <w:i w:val="0"/>
                 <w:sz w:val="21"/>
               </w:rPr>
-              <w:t>[a concretar]</w:t>
+              <w:t>Esporga mitjana (comercial)</w:t>
             </w:r>
           </w:p>
         </w:tc>
-      </w:tr>
-      <w:tr>
         <w:tc>
           <w:tcPr>
-            <w:tcW w:type="dxa" w:w="850"/>
+            <w:tcW w:type="dxa" w:w="3855"/>
           </w:tcPr>
           <w:p>
             <w:pPr>
@@ -2706,13 +2714,15 @@
                 <w:i w:val="0"/>
                 <w:sz w:val="21"/>
               </w:rPr>
-              <w:t>T3</w:t>
+              <w:t>Maneig comercial de referència; capçada intermèdia</w:t>
             </w:r>
           </w:p>
         </w:tc>
+      </w:tr>
+      <w:tr>
         <w:tc>
           <w:tcPr>
-            <w:tcW w:type="dxa" w:w="2268"/>
+            <w:tcW w:type="dxa" w:w="907"/>
           </w:tcPr>
           <w:p>
             <w:pPr>
@@ -2725,13 +2735,13 @@
                 <w:i w:val="0"/>
                 <w:sz w:val="21"/>
               </w:rPr>
-              <w:t>Poda mínima</w:t>
+              <w:t>ES</w:t>
             </w:r>
           </w:p>
         </w:tc>
         <w:tc>
           <w:tcPr>
-            <w:tcW w:type="dxa" w:w="3685"/>
+            <w:tcW w:type="dxa" w:w="2608"/>
           </w:tcPr>
           <w:p>
             <w:pPr>
@@ -2744,13 +2754,13 @@
                 <w:i w:val="0"/>
                 <w:sz w:val="21"/>
               </w:rPr>
-              <w:t>Intervenció mínima; dosser dens però poc estructurat</w:t>
+              <w:t>Esporga severa</w:t>
             </w:r>
           </w:p>
         </w:tc>
         <w:tc>
           <w:tcPr>
-            <w:tcW w:type="dxa" w:w="1701"/>
+            <w:tcW w:type="dxa" w:w="3855"/>
           </w:tcPr>
           <w:p>
             <w:pPr>
@@ -2763,7 +2773,66 @@
                 <w:i w:val="0"/>
                 <w:sz w:val="21"/>
               </w:rPr>
-              <w:t>[a concretar]</w:t>
+              <w:t>Reducció intensa de la capçada; mida mínima</w:t>
+            </w:r>
+          </w:p>
+        </w:tc>
+      </w:tr>
+      <w:tr>
+        <w:tc>
+          <w:tcPr>
+            <w:tcW w:type="dxa" w:w="907"/>
+          </w:tcPr>
+          <w:p>
+            <w:pPr>
+              <w:jc w:val="left"/>
+            </w:pPr>
+            <w:r>
+              <w:rPr>
+                <w:rFonts w:ascii="Arial" w:hAnsi="Arial" w:cs="Arial"/>
+                <w:b w:val="0"/>
+                <w:i w:val="0"/>
+                <w:sz w:val="21"/>
+              </w:rPr>
+              <w:t>ES+DV</w:t>
+            </w:r>
+          </w:p>
+        </w:tc>
+        <w:tc>
+          <w:tcPr>
+            <w:tcW w:type="dxa" w:w="2608"/>
+          </w:tcPr>
+          <w:p>
+            <w:pPr>
+              <w:jc w:val="left"/>
+            </w:pPr>
+            <w:r>
+              <w:rPr>
+                <w:rFonts w:ascii="Arial" w:hAnsi="Arial" w:cs="Arial"/>
+                <w:b w:val="0"/>
+                <w:i w:val="0"/>
+                <w:sz w:val="21"/>
+              </w:rPr>
+              <w:t>Esporga severa + desfullat a verolat</w:t>
+            </w:r>
+          </w:p>
+        </w:tc>
+        <w:tc>
+          <w:tcPr>
+            <w:tcW w:type="dxa" w:w="3855"/>
+          </w:tcPr>
+          <w:p>
+            <w:pPr>
+              <w:jc w:val="left"/>
+            </w:pPr>
+            <w:r>
+              <w:rPr>
+                <w:rFonts w:ascii="Arial" w:hAnsi="Arial" w:cs="Arial"/>
+                <w:b w:val="0"/>
+                <w:i w:val="0"/>
+                <w:sz w:val="21"/>
+              </w:rPr>
+              <w:t>Esporga severa amb desfullat addicional en verolat</w:t>
             </w:r>
           </w:p>
         </w:tc>
@@ -2782,7 +2851,7 @@
       <w:r>
         <w:drawing>
           <wp:inline xmlns:a="http://schemas.openxmlformats.org/drawingml/2006/main" xmlns:pic="http://schemas.openxmlformats.org/drawingml/2006/picture">
-            <wp:extent cx="4680000" cy="2541818"/>
+            <wp:extent cx="4860000" cy="2797590"/>
             <wp:docPr id="5" name="Picture 5"/>
             <wp:cNvGraphicFramePr>
               <a:graphicFrameLocks noChangeAspect="1"/>
@@ -2803,7 +2872,7 @@
                   <pic:spPr>
                     <a:xfrm>
                       <a:off x="0" y="0"/>
-                      <a:ext cx="4680000" cy="2541818"/>
+                      <a:ext cx="4860000" cy="2797590"/>
                     </a:xfrm>
                     <a:prstGeom prst="rect"/>
                   </pic:spPr>
@@ -2846,7 +2915,7 @@
           <w:i w:val="0"/>
           <w:sz w:val="20"/>
         </w:rPr>
-        <w:t xml:space="preserve">. Croquis del disseny experimental en blocs complets a l'atzar amb tres tractaments de poda (T1, T2, T3) i tres blocs. </w:t>
+        <w:t xml:space="preserve">. Croquis del disseny experimental de l'assaig ADAPTEX: cinc tractaments de maneig de capçada (SE, EL, EM, ES, ES+DV) × quatre blocs = 20 parcel·les experimentals de 24 ceps cadascuna. </w:t>
       </w:r>
       <w:r>
         <w:rPr>
@@ -2855,23 +2924,7 @@
           <w:i/>
           <w:sz w:val="20"/>
         </w:rPr>
-        <w:t>Font: elaboració pròpia.</w:t>
-      </w:r>
-    </w:p>
-    <w:p>
-      <w:pPr>
-        <w:spacing w:after="120" w:before="0"/>
-        <w:jc w:val="left"/>
-      </w:pPr>
-      <w:r>
-        <w:rPr>
-          <w:rFonts w:ascii="Arial" w:hAnsi="Arial" w:cs="Arial"/>
-          <w:b w:val="0"/>
-          <w:i/>
-          <w:color w:val="B00000"/>
-          <w:sz w:val="22"/>
-        </w:rPr>
-        <w:t>[A CONCRETAR] Definició exacta dels tractaments (confirmar sistemes i nombre de gemmes), nombre de ceps per parcel·la elemental i dimensions/orientació reals dels blocs a la parcel·la.</w:t>
+        <w:t>Font: elaboració pròpia a partir del croquis de l'assaig ADAPTEX (IRTA).</w:t>
       </w:r>
     </w:p>
     <w:p>
@@ -3795,7 +3848,7 @@
           <w:i w:val="0"/>
           <w:sz w:val="24"/>
         </w:rPr>
-        <w:t>L'efecte dels tractaments de poda sobre les variables biofísiques del dosser (LAI, fIPAR, alçada, volum), sobre l'ETa, l'ETp i el CWSI, i sobre el Ψstem s'analitzarà mitjançant una anàlisi de la variància (ANOVA) considerant els factors tractament, data i bloc. Quan l'ANOVA detecti diferències significatives, la separació de mitjanes es farà amb el test HSD de Tukey (p &lt; 0,05), seguint el mateix enfocament aplicat en estudis equivalents en fruiters (Bellvert et al., 2021). La concordança entre els mètodes de mesura de la fIPAR (dron, ceptòmetre i imatge hemisfèrica) i entre el CWSI i el Ψstem s'avaluarà amb regressió lineal i estadístics de bondat d'ajust (coeficient de determinació R², error quadràtic mitjà RMSE i biaix). Es comprovaran prèviament els supòsits de normalitat dels residus i d'homogeneïtat de variàncies.</w:t>
+        <w:t>L'efecte dels tractaments de maneig de capçada sobre les variables biofísiques del dosser (LAI, fIPAR, alçada, volum), sobre l'ETa, l'ETp i el CWSI, i sobre el Ψstem s'analitzarà comparant els cinc tractaments en cada data de mesura. Quan es compleixin els supòsits de normalitat dels residus i d'homogeneïtat de variàncies, s'aplicarà una anàlisi de la variància (ANOVA) amb separació de mitjanes mitjançant el test HSD de Tukey (p &lt; 0,05), tal com s'ha fet en estudis equivalents en fruiters (Bellvert et al., 2021). En cas que aquests supòsits no es compleixin, s'utilitzarà l'alternativa no paramètrica de Kruskal–Wallis, criteri adoptat de manera consistent amb l'anàlisi de l'assaig ADAPTEX a l'IRTA. La concordança entre els mètodes de mesura de la fIPAR (dron, ceptòmetre i imatge hemisfèrica) i entre el CWSI i el Ψstem s'avaluarà amb regressió lineal i estadístics de bondat d'ajust (coeficient de determinació R², error quadràtic mitjà RMSE i biaix).</w:t>
       </w:r>
     </w:p>
     <w:p>
@@ -3857,7 +3910,7 @@
           <w:i w:val="0"/>
           <w:sz w:val="26"/>
         </w:rPr>
-        <w:t>5.1. Variables biofísiques del dosser per tractament de poda</w:t>
+        <w:t>5.1. Variables biofísiques del dosser per tractament de capçada</w:t>
       </w:r>
     </w:p>
     <w:p>
@@ -3873,7 +3926,7 @@
           <w:color w:val="B00000"/>
           <w:sz w:val="22"/>
         </w:rPr>
-        <w:t>Taules/figures de LAI, fIPAR, alçada i volum per tractament i data; resultats de l'ANOVA i lletres de separació de mitjanes (Tukey).</w:t>
+        <w:t>Taules/figures de LAI, fIPAR, alçada i volum del dosser per als cinc tractaments (SE, EL, EM, ES, ES+DV) i les tres dates; resultats del test (ANOVA + Tukey o Kruskal–Wallis) amb lletres de separació de mitjanes.</w:t>
       </w:r>
     </w:p>
     <w:p>
@@ -3904,7 +3957,7 @@
           <w:color w:val="B00000"/>
           <w:sz w:val="22"/>
         </w:rPr>
-        <w:t>Regressions i estadístics (R², RMSE, biaix) entre els tres mètodes; corbes diürnes de fIPAR.</w:t>
+        <w:t>Regressions i estadístics (R², RMSE, biaix) entre els tres mètodes; corbes diürnes de fIPAR per tractament.</w:t>
       </w:r>
     </w:p>
     <w:p>
@@ -3919,7 +3972,7 @@
           <w:i w:val="0"/>
           <w:sz w:val="26"/>
         </w:rPr>
-        <w:t>5.3. Evapotranspiració (ETa i ETp) per tractament de poda</w:t>
+        <w:t>5.3. Evapotranspiració (ETa i ETp) per tractament de capçada</w:t>
       </w:r>
     </w:p>
     <w:p>
@@ -3935,7 +3988,7 @@
           <w:color w:val="B00000"/>
           <w:sz w:val="22"/>
         </w:rPr>
-        <w:t>Valors d'ETa i ETp estimats amb TSEB i S–W per tractament i data; partició transpiració/evaporació; resultats de l'ANOVA.</w:t>
+        <w:t>Valors d'ETa i ETp estimats amb TSEB i S–W per tractament i data; partició transpiració/evaporació; comparació amb l'aigua de reg aplicada i, si escau, amb les mesures de flux de saba (cabalímetres) de l'assaig.</w:t>
       </w:r>
     </w:p>
     <w:p>
@@ -3966,7 +4019,7 @@
           <w:color w:val="B00000"/>
           <w:sz w:val="22"/>
         </w:rPr>
-        <w:t>CWSI per tractament; regressió CWSI–Ψstem; mapes d'estrès hídric.</w:t>
+        <w:t>CWSI per tractament; regressió CWSI–Ψstem; mapes d'estrès hídric. Atès que el reg manté un mateix estat hídric entre tractaments, valoreu fins a quin punt el CWSI reflecteix l'arquitectura del dosser més que no pas l'estrès imposat.</w:t>
       </w:r>
     </w:p>
     <w:p>
@@ -3997,7 +4050,7 @@
           <w:color w:val="B00000"/>
           <w:sz w:val="22"/>
         </w:rPr>
-        <w:t>[CAPÍTOL A OMPLIR] Interpreteu els resultats a la llum de la literatura (Bellvert et al., 2014, 2021; Belaid et al., 2025; Choné et al., 2001). Discutiu: (i) com la poda modifica el dosser i l'ET; (ii) la fiabilitat de la fIPAR per imatge hemisfèrica respecte del ceptòmetre; (iii) la coherència entre CWSI i Ψstem; (iv) limitacions i implicacions per al reg de precisió.</w:t>
+        <w:t>[CAPÍTOL A OMPLIR] Interpreteu els resultats a la llum de la literatura (Bellvert et al., 2014, 2021; Belaid et al., 2025; Choné et al., 2001) i de les dades de l'assaig ADAPTEX (Blanco et al., 2025). Discutiu: (i) com el maneig de capçada modifica el dosser i l'ET; (ii) la coherència de l'ETa estimada amb el consum d'aigua de reg observat i amb el flux de saba; (iii) la fiabilitat de la fIPAR per imatge hemisfèrica respecte del ceptòmetre; (iv) la relació CWSI–Ψstem; (v) limitacions i implicacions per al reg de precisió.</w:t>
       </w:r>
     </w:p>
     <w:p>
@@ -4108,6 +4161,22 @@
           <w:sz w:val="24"/>
         </w:rPr>
         <w:t>Bellvert, J., Zarco-Tejada, P. J., Girona, J., &amp; Fereres, E. (2014). Mapping crop water stress index in a 'Pinot-noir' vineyard: Comparing ground measurements with thermal remote sensing imagery from an unmanned aerial vehicle. Precision Agriculture, 15(4), 361–376. https://doi.org/10.1007/s11119-013-9334-5</w:t>
+      </w:r>
+    </w:p>
+    <w:p>
+      <w:pPr>
+        <w:spacing w:after="160"/>
+        <w:ind w:left="709" w:hanging="709"/>
+        <w:jc w:val="both"/>
+      </w:pPr>
+      <w:r>
+        <w:rPr>
+          <w:rFonts w:ascii="Arial" w:hAnsi="Arial" w:cs="Arial"/>
+          <w:b w:val="0"/>
+          <w:i w:val="0"/>
+          <w:sz w:val="24"/>
+        </w:rPr>
+        <w:t>Blanco, V., Gutiérrez, N., Mata, M., Paris, C., Biru, A., &amp; Girona, J. (2025). Maneig de capçada com a estratègia per augmentar la resiliència de la vinya enfront del canvi climàtic: Resultats temporada 2025 [Comunicació interna]. IRTA – Programa d'Ús Eficient de l'Aigua en Agricultura.</w:t>
       </w:r>
     </w:p>
     <w:p>

</xml_diff>

<commit_message>
TFM: distingir sensors de flux de saba (sap flow) dels cabalímetres
Corregeix la confusió: els sensors de flux de saba (sap flow sensors) mesuren
la transpiració de la planta, mentre que els cabalímetres registren l'aigua de
reg aplicada. S'actualitzen les mencions a la introducció i als capítols de
resultats i discussió.

Co-Authored-By: Claude Opus 4.8 <noreply@anthropic.com>
Claude-Session: https://claude.ai/code/session_015S8J5VNEjqUNJtc1c5qPf1
</commit_message>
<xml_diff>
--- a/TFM_Pau_Planes.docx
+++ b/TFM_Pau_Planes.docx
@@ -1358,7 +1358,7 @@
           <w:i w:val="0"/>
           <w:sz w:val="24"/>
         </w:rPr>
-        <w:t>Concretament, el treball s'emmarca en l'assaig de maneig de capçada que el Programa d'Ús Eficient de l'Aigua de l'IRTA desenvolupa en una parcel·la de la varietat 'Ull de Llebre' (Tempranillo) a Raimat, dins dels projectes VITIMPACT i ADAPTEX, amb l'objectiu d'augmentar la resiliència de la vinya davant del canvi climàtic. En aquest assaig, cinc nivells d'esporga generen capçades de mides contrastades i, en campanyes anteriors, s'han observat diferències notables en el consum d'aigua de reg entre tractaments —les capçades més grans han arribat a consumir fins a un 14 % més d'aigua que el maneig comercial, mentre que l'esporga severa l'ha reduït prop d'un 20 %. El present TFM aborda precisament una de les línies de treball futures previstes en aquest assaig: la quantificació de la transpiració i de l'evapotranspiració mitjançant teledetecció, com a complement a les mesures directes de flux de saba i de potencial hídric.</w:t>
+        <w:t>Concretament, el treball s'emmarca en l'assaig de maneig de capçada que el Programa d'Ús Eficient de l'Aigua de l'IRTA desenvolupa en una parcel·la de la varietat 'Ull de Llebre' (Tempranillo) a Raimat, dins dels projectes VITIMPACT i ADAPTEX, amb l'objectiu d'augmentar la resiliència de la vinya davant del canvi climàtic. En aquest assaig, cinc nivells d'esporga generen capçades de mides contrastades i, en campanyes anteriors, s'han observat diferències notables en el consum d'aigua de reg entre tractaments —les capçades més grans han arribat a consumir fins a un 14 % més d'aigua que el maneig comercial, mentre que l'esporga severa l'ha reduït prop d'un 20 %. El present TFM aborda precisament una de les línies de treball futures previstes en aquest assaig: la quantificació de la transpiració i de l'evapotranspiració mitjançant teledetecció, com a complement a les mesures directes de transpiració amb sensors de flux de saba (sap flow sensors) i al seguiment del potencial hídric de tija.</w:t>
       </w:r>
     </w:p>
     <w:p>
@@ -3988,7 +3988,7 @@
           <w:color w:val="B00000"/>
           <w:sz w:val="22"/>
         </w:rPr>
-        <w:t>Valors d'ETa i ETp estimats amb TSEB i S–W per tractament i data; partició transpiració/evaporació; comparació amb l'aigua de reg aplicada i, si escau, amb les mesures de flux de saba (cabalímetres) de l'assaig.</w:t>
+        <w:t>Valors d'ETa i ETp estimats amb TSEB i S–W per tractament i data; partició transpiració/evaporació; comparació amb la transpiració mesurada amb sensors de flux de saba (sap flow sensors) i amb l'aigua de reg aplicada (registrada amb cabalímetres) de l'assaig.</w:t>
       </w:r>
     </w:p>
     <w:p>
@@ -4050,7 +4050,7 @@
           <w:color w:val="B00000"/>
           <w:sz w:val="22"/>
         </w:rPr>
-        <w:t>[CAPÍTOL A OMPLIR] Interpreteu els resultats a la llum de la literatura (Bellvert et al., 2014, 2021; Belaid et al., 2025; Choné et al., 2001) i de les dades de l'assaig ADAPTEX (Blanco et al., 2025). Discutiu: (i) com el maneig de capçada modifica el dosser i l'ET; (ii) la coherència de l'ETa estimada amb el consum d'aigua de reg observat i amb el flux de saba; (iii) la fiabilitat de la fIPAR per imatge hemisfèrica respecte del ceptòmetre; (iv) la relació CWSI–Ψstem; (v) limitacions i implicacions per al reg de precisió.</w:t>
+        <w:t>[CAPÍTOL A OMPLIR] Interpreteu els resultats a la llum de la literatura (Bellvert et al., 2014, 2021; Belaid et al., 2025; Choné et al., 2001) i de les dades de l'assaig ADAPTEX (Blanco et al., 2025). Discutiu: (i) com el maneig de capçada modifica el dosser i l'ET; (ii) la coherència de l'ETa estimada amb el consum d'aigua de reg observat i amb la transpiració dels sensors de flux de saba (sap flow); (iii) la fiabilitat de la fIPAR per imatge hemisfèrica respecte del ceptòmetre; (iv) la relació CWSI–Ψstem; (v) limitacions i implicacions per al reg de precisió.</w:t>
       </w:r>
     </w:p>
     <w:p>

</xml_diff>

<commit_message>
TFM: redactar agraïments formals
Substitueix la plantilla d'agraïments per un text formal complet que agraeix
als tutors (Dr. Martínez Casasnovas i Dr. Bellvert), a l'equip del Programa
d'Ús Eficient de l'Aigua de l'IRTA (amb els noms de l'equip de l'assaig), al
personal de la finca, a la UdL/ETSEA i a família i amics.

Co-Authored-By: Claude Opus 4.8 <noreply@anthropic.com>
Claude-Session: https://claude.ai/code/session_015S8J5VNEjqUNJtc1c5qPf1
</commit_message>
<xml_diff>
--- a/TFM_Pau_Planes.docx
+++ b/TFM_Pau_Planes.docx
@@ -474,17 +474,85 @@
     <w:p>
       <w:pPr>
         <w:spacing w:after="120" w:before="0"/>
-        <w:jc w:val="left"/>
+      </w:pPr>
+      <w:r>
+        <w:rPr>
+          <w:rFonts w:ascii="Arial" w:hAnsi="Arial" w:cs="Arial"/>
+          <w:b w:val="0"/>
+          <w:i w:val="0"/>
+          <w:sz w:val="24"/>
+        </w:rPr>
+        <w:t>La realització d'aquest Treball Final de Màster no hauria estat possible sense l'ajuda, la dedicació i el suport de moltes persones i institucions, a les quals voldria expressar el meu més sincer agraïment.</w:t>
+      </w:r>
+    </w:p>
+    <w:p>
+      <w:pPr>
+        <w:spacing w:after="120" w:before="0"/>
+      </w:pPr>
+      <w:r>
+        <w:rPr>
+          <w:rFonts w:ascii="Arial" w:hAnsi="Arial" w:cs="Arial"/>
+          <w:b w:val="0"/>
+          <w:i w:val="0"/>
+          <w:sz w:val="24"/>
+        </w:rPr>
+        <w:t>En primer lloc, vull donar les gràcies als meus tutors, el Dr. José Antonio Martínez Casasnovas (Universitat de Lleida) i el Dr. Joaquim Bellvert (IRTA), per haver-me brindat l'oportunitat de dur a terme aquest treball, per la seva orientació constant, la seva paciència i els coneixements que m'han transmès al llarg de tot el procés. La seva implicació i la seva exigència han estat fonamentals per donar forma i rigor a aquest projecte.</w:t>
+      </w:r>
+    </w:p>
+    <w:p>
+      <w:pPr>
+        <w:spacing w:after="120" w:before="0"/>
+      </w:pPr>
+      <w:r>
+        <w:rPr>
+          <w:rFonts w:ascii="Arial" w:hAnsi="Arial" w:cs="Arial"/>
+          <w:b w:val="0"/>
+          <w:i w:val="0"/>
+          <w:sz w:val="24"/>
+        </w:rPr>
+        <w:t>Vull agrair molt especialment a tot l'equip del Programa d'Ús Eficient de l'Aigua en Agricultura de l'IRTA l'acollida i el suport rebuts durant la part experimental. De manera particular, agraeixo a en Víctor Blanco, la Nerea Gutiérrez, la Mercè Mata, en Carles Paris, l'Aurica Biru i en Joan Girona la seva disponibilitat, els seus consells i la seva ajuda en el treball de camp i en la comprensió de l'assaig de maneig de capçada en què s'emmarca aquest TFM.</w:t>
+      </w:r>
+    </w:p>
+    <w:p>
+      <w:pPr>
+        <w:spacing w:after="120" w:before="0"/>
+      </w:pPr>
+      <w:r>
+        <w:rPr>
+          <w:rFonts w:ascii="Arial" w:hAnsi="Arial" w:cs="Arial"/>
+          <w:b w:val="0"/>
+          <w:i w:val="0"/>
+          <w:sz w:val="24"/>
+        </w:rPr>
+        <w:t>Faig extensiu aquest agraïment al personal de la finca experimental i a totes les persones que, d'una manera o altra, han participat en les tasques d'assaig, mesura i processament de dades, així com a la Universitat de Lleida i a l'Escola Tècnica Superior d'Enginyeria Agroalimentària i Forestal i de Veterinària per la formació rebuda durant aquests anys.</w:t>
+      </w:r>
+    </w:p>
+    <w:p>
+      <w:pPr>
+        <w:spacing w:after="120" w:before="0"/>
+      </w:pPr>
+      <w:r>
+        <w:rPr>
+          <w:rFonts w:ascii="Arial" w:hAnsi="Arial" w:cs="Arial"/>
+          <w:b w:val="0"/>
+          <w:i w:val="0"/>
+          <w:sz w:val="24"/>
+        </w:rPr>
+        <w:t>Finalment, però no per això menys important, vull donar les gràcies a la meva família i als meus amics pel seu suport incondicional, la seva paciència i els seus ànims al llarg de tot aquest camí.</w:t>
+      </w:r>
+    </w:p>
+    <w:p>
+      <w:pPr>
+        <w:spacing w:after="120" w:before="0"/>
       </w:pPr>
       <w:r>
         <w:rPr>
           <w:rFonts w:ascii="Arial" w:hAnsi="Arial" w:cs="Arial"/>
           <w:b w:val="0"/>
           <w:i/>
-          <w:color w:val="B00000"/>
-          <w:sz w:val="22"/>
+          <w:sz w:val="24"/>
         </w:rPr>
-        <w:t>[A PERSONALITZAR PER L'AUTOR] Espai per agrair als tutors (Dr. José A. Martínez Casasnovas i Dr. Joaquim Bellvert), a l'equip del Programa d'Ús Eficient de l'Aigua de l'IRTA, al personal de la finca experimental i a la família i amics. Vegeu l'estil dels TFM d'exemple (Alsina, 2020; Cuñé, 2019).</w:t>
+        <w:t>A tots vosaltres, moltes gràcies.</w:t>
       </w:r>
     </w:p>
     <w:p>

</xml_diff>

<commit_message>
TFM: humanitzar els agraïments i ajustar equip IRTA i universitat
Reescriu el primer i l'últim paràgraf amb un to més personal i proper,
actualitza l'equip de l'IRTA (Joaquim Bellvert com a cap de programa, Víctor
Blanco investigador i els companys) i afegeix un paràgraf propi d'agraïment a
la UdL i l'ETSEA.

Co-Authored-By: Claude Opus 4.8 <noreply@anthropic.com>
Claude-Session: https://claude.ai/code/session_015S8J5VNEjqUNJtc1c5qPf1
</commit_message>
<xml_diff>
--- a/TFM_Pau_Planes.docx
+++ b/TFM_Pau_Planes.docx
@@ -482,7 +482,7 @@
           <w:i w:val="0"/>
           <w:sz w:val="24"/>
         </w:rPr>
-        <w:t>La realització d'aquest Treball Final de Màster no hauria estat possible sense l'ajuda, la dedicació i el suport de moltes persones i institucions, a les quals voldria expressar el meu més sincer agraïment.</w:t>
+        <w:t>Darrere d'aquest Treball Final de Màster hi ha molt més que hores de camp i d'anàlisi: hi ha totes les persones que, d'una manera o altra, m'han acompanyat durant aquest camí. Sense la seva ajuda, la seva paciència i els seus ànims aquest treball no hauria estat possible, i és per això que vull dedicar-los aquestes primeres línies amb el meu agraïment més sincer.</w:t>
       </w:r>
     </w:p>
     <w:p>
@@ -510,7 +510,7 @@
           <w:i w:val="0"/>
           <w:sz w:val="24"/>
         </w:rPr>
-        <w:t>Vull agrair molt especialment a tot l'equip del Programa d'Ús Eficient de l'Aigua en Agricultura de l'IRTA l'acollida i el suport rebuts durant la part experimental. De manera particular, agraeixo a en Víctor Blanco, la Nerea Gutiérrez, la Mercè Mata, en Carles Paris, l'Aurica Biru i en Joan Girona la seva disponibilitat, els seus consells i la seva ajuda en el treball de camp i en la comprensió de l'assaig de maneig de capçada en què s'emmarca aquest TFM.</w:t>
+        <w:t>Vull agrair molt especialment a tot l'equip del Programa d'Ús Eficient de l'Aigua de l'IRTA l'acollida i el suport rebuts durant la part experimental. De manera particular, agraeixo a en Joaquim Bellvert (cap de programa) i a en Víctor Blanco (investigador) la seva disponibilitat i els seus consells i, sobretot, als meus companys i companyes, per la seva ajuda en el treball de camp i per haver-me fet entendre, des de dins, l'assaig de maneig de capçada en què s'emmarca aquest TFM.</w:t>
       </w:r>
     </w:p>
     <w:p>
@@ -524,7 +524,7 @@
           <w:i w:val="0"/>
           <w:sz w:val="24"/>
         </w:rPr>
-        <w:t>Faig extensiu aquest agraïment al personal de la finca experimental i a totes les persones que, d'una manera o altra, han participat en les tasques d'assaig, mesura i processament de dades, així com a la Universitat de Lleida i a l'Escola Tècnica Superior d'Enginyeria Agroalimentària i Forestal i de Veterinària per la formació rebuda durant aquests anys.</w:t>
+        <w:t>També vull tenir un record per a la Universitat de Lleida i, en especial, per a l'Escola Tècnica Superior d'Enginyeria Agroalimentària i Forestal i de Veterinària, on he crescut aquests anys tant a nivell acadèmic com personal, i per als professors i companys de màster que han fet d'aquesta etapa una experiència que recordaré amb afecte.</w:t>
       </w:r>
     </w:p>
     <w:p>
@@ -538,7 +538,7 @@
           <w:i w:val="0"/>
           <w:sz w:val="24"/>
         </w:rPr>
-        <w:t>Finalment, però no per això menys important, vull donar les gràcies a la meva família i als meus amics pel seu suport incondicional, la seva paciència i els seus ànims al llarg de tot aquest camí.</w:t>
+        <w:t>I, finalment, el més important de tot: gràcies a la meva família i als meus amics. Gràcies per ser-hi sempre, per la paciència en els moments difícils i per creure en mi fins i tot quan a mi em costava. Aquest treball també és una mica vostre.</w:t>
       </w:r>
     </w:p>
     <w:p>
@@ -552,7 +552,7 @@
           <w:i/>
           <w:sz w:val="24"/>
         </w:rPr>
-        <w:t>A tots vosaltres, moltes gràcies.</w:t>
+        <w:t>A tots vosaltres, de tot cor, moltes gràcies.</w:t>
       </w:r>
     </w:p>
     <w:p>

</xml_diff>

<commit_message>
TFM: millorar la Figura 1 (TSEB) i explicar Hc/Hs i LEc/LEs
Redissenya l'esquema del balanç energètic per evitar solapaments d'etiquetes,
afegeix les equacions H=Hc+Hs i LE=LEc+LEs, descripcions de cada flux i una
llegenda de subíndexs (c=dosser/canopy, s=sòl/soil). Amplia el peu de figura
per definir Hc (calor sensible del dosser) i Hs (calor sensible del sòl).

Co-Authored-By: Claude Opus 4.8 <noreply@anthropic.com>
Claude-Session: https://claude.ai/code/session_015S8J5VNEjqUNJtc1c5qPf1
</commit_message>
<xml_diff>
--- a/TFM_Pau_Planes.docx
+++ b/TFM_Pau_Planes.docx
@@ -1567,7 +1567,7 @@
       <w:r>
         <w:drawing>
           <wp:inline xmlns:a="http://schemas.openxmlformats.org/drawingml/2006/main" xmlns:pic="http://schemas.openxmlformats.org/drawingml/2006/picture">
-            <wp:extent cx="4860000" cy="3071465"/>
+            <wp:extent cx="4860000" cy="3197980"/>
             <wp:docPr id="1" name="Picture 1"/>
             <wp:cNvGraphicFramePr>
               <a:graphicFrameLocks noChangeAspect="1"/>
@@ -1588,7 +1588,7 @@
                   <pic:spPr>
                     <a:xfrm>
                       <a:off x="0" y="0"/>
-                      <a:ext cx="4860000" cy="3071465"/>
+                      <a:ext cx="4860000" cy="3197980"/>
                     </a:xfrm>
                     <a:prstGeom prst="rect"/>
                   </pic:spPr>
@@ -1631,7 +1631,7 @@
           <w:i w:val="0"/>
           <w:sz w:val="20"/>
         </w:rPr>
-        <w:t xml:space="preserve">. Esquema del balanç d'energia de la superfície i de la partició de fluxos entre el sòl i el dosser en què es fonamenta el model de balanç energètic de dues fonts (TSEB). Rn: radiació neta; G: flux de calor al sòl; H: calor sensible; LE: calor latent (LEc del dosser i LEs del sòl); Tc i Ts: temperatures de dosser i de sòl. </w:t>
+        <w:t xml:space="preserve">. Esquema del balanç d'energia de la superfície i de la partició de fluxos entre el sòl i el dosser en què es fonamenta el model de balanç energètic de dues fonts (TSEB). Rn: radiació neta; G: flux de calor cap al sòl; H: calor sensible, amb les seves components del dosser (Hc) i del sòl (Hs); LE: calor latent, amb les components de transpiració del dosser (LEc) i d'evaporació del sòl (LEs); Tc i Ts: temperatures de dosser i de sòl. Els subíndexs c i s indiquen, respectivament, dosser (canopy) i sòl (soil). </w:t>
       </w:r>
       <w:r>
         <w:rPr>

</xml_diff>

<commit_message>
TFM: refer la Figura 1 amb fletxes sense solapaments
Reajusta la disposició de l'esquema TSEB perquè cap fletxa toqui el text ni el
dibuix: fletxes més curtes amb marge clar respecte de les etiquetes i llegenda
reubicada.

Co-Authored-By: Claude Opus 4.8 <noreply@anthropic.com>
Claude-Session: https://claude.ai/code/session_015S8J5VNEjqUNJtc1c5qPf1
</commit_message>
<xml_diff>
--- a/TFM_Pau_Planes.docx
+++ b/TFM_Pau_Planes.docx
@@ -1567,7 +1567,7 @@
       <w:r>
         <w:drawing>
           <wp:inline xmlns:a="http://schemas.openxmlformats.org/drawingml/2006/main" xmlns:pic="http://schemas.openxmlformats.org/drawingml/2006/picture">
-            <wp:extent cx="4860000" cy="3197980"/>
+            <wp:extent cx="4860000" cy="3134991"/>
             <wp:docPr id="1" name="Picture 1"/>
             <wp:cNvGraphicFramePr>
               <a:graphicFrameLocks noChangeAspect="1"/>
@@ -1588,7 +1588,7 @@
                   <pic:spPr>
                     <a:xfrm>
                       <a:off x="0" y="0"/>
-                      <a:ext cx="4860000" cy="3197980"/>
+                      <a:ext cx="4860000" cy="3134991"/>
                     </a:xfrm>
                     <a:prstGeom prst="rect"/>
                   </pic:spPr>

</xml_diff>